<commit_message>
Septeo Draft 2, correction round: minimum back, 8.6 on supplier fees, 5.2 restored
- 8.4: minimum reinstated on the Fixed Fees, in STP counsel's own formula (#22):
  EUR 750 for the first three months, then EUR 1.500; 14.2a stop restored.
  STP had accepted the minimum; Draft 2 had dropped it unasked.
- 8.6: price changes follow the fees of the supplier or register, not our own
  cost. As drafted, a move to a direct route would have forced a price cut and
  undone the tier-amount definition. Six-month freeze removed.
- 5.2 back to 24 months; 5.2a no longer exempts extension to further registers.
- 3.5: Founders1 states register-specific restrictions with the Document.
- Replies #7, #8, #14, #22, #23, #35 rewritten: no supplier names, no positions
  not decided.

Co-Authored-By: Claude Opus 5.5 (1M context) <noreply@anthropic.com>
</commit_message>
<xml_diff>
--- a/docs/SEPTEO_RESELLER_AGREEMENT_DRAFT2_2026-09-24.docx
+++ b/docs/SEPTEO_RESELLER_AGREEMENT_DRAFT2_2026-09-24.docx
@@ -6,7 +6,7 @@
       <w:pPr>
         <w:pStyle w:val="berschrift1"/>
       </w:pPr>
-      <w:bookmarkStart w:id="0" w:name="_Toc241158449"/>
+      <w:bookmarkStart w:id="0" w:name="_Toc241160896"/>
       <w:r>
         <w:t>Contents</w:t>
       </w:r>
@@ -80,7 +80,7 @@
         <w:rPr>
           <w:noProof/>
         </w:rPr>
-        <w:instrText xml:space="preserve"> PAGEREF _Toc241158449 \h </w:instrText>
+        <w:instrText xml:space="preserve"> PAGEREF _Toc241160896 \h </w:instrText>
       </w:r>
       <w:r>
         <w:rPr>
@@ -142,7 +142,7 @@
         <w:rPr>
           <w:noProof/>
         </w:rPr>
-        <w:instrText xml:space="preserve"> PAGEREF _Toc241158450 \h </w:instrText>
+        <w:instrText xml:space="preserve"> PAGEREF _Toc241160897 \h </w:instrText>
       </w:r>
       <w:r>
         <w:rPr>
@@ -204,7 +204,7 @@
         <w:rPr>
           <w:noProof/>
         </w:rPr>
-        <w:instrText xml:space="preserve"> PAGEREF _Toc241158451 \h </w:instrText>
+        <w:instrText xml:space="preserve"> PAGEREF _Toc241160898 \h </w:instrText>
       </w:r>
       <w:r>
         <w:rPr>
@@ -266,7 +266,7 @@
         <w:rPr>
           <w:noProof/>
         </w:rPr>
-        <w:instrText xml:space="preserve"> PAGEREF _Toc241158452 \h </w:instrText>
+        <w:instrText xml:space="preserve"> PAGEREF _Toc241160899 \h </w:instrText>
       </w:r>
       <w:r>
         <w:rPr>
@@ -328,7 +328,7 @@
         <w:rPr>
           <w:noProof/>
         </w:rPr>
-        <w:instrText xml:space="preserve"> PAGEREF _Toc241158453 \h </w:instrText>
+        <w:instrText xml:space="preserve"> PAGEREF _Toc241160900 \h </w:instrText>
       </w:r>
       <w:r>
         <w:rPr>
@@ -390,7 +390,7 @@
         <w:rPr>
           <w:noProof/>
         </w:rPr>
-        <w:instrText xml:space="preserve"> PAGEREF _Toc241158454 \h </w:instrText>
+        <w:instrText xml:space="preserve"> PAGEREF _Toc241160901 \h </w:instrText>
       </w:r>
       <w:r>
         <w:rPr>
@@ -452,7 +452,7 @@
         <w:rPr>
           <w:noProof/>
         </w:rPr>
-        <w:instrText xml:space="preserve"> PAGEREF _Toc241158455 \h </w:instrText>
+        <w:instrText xml:space="preserve"> PAGEREF _Toc241160902 \h </w:instrText>
       </w:r>
       <w:r>
         <w:rPr>
@@ -514,7 +514,7 @@
         <w:rPr>
           <w:noProof/>
         </w:rPr>
-        <w:instrText xml:space="preserve"> PAGEREF _Toc241158456 \h </w:instrText>
+        <w:instrText xml:space="preserve"> PAGEREF _Toc241160903 \h </w:instrText>
       </w:r>
       <w:r>
         <w:rPr>
@@ -576,7 +576,7 @@
         <w:rPr>
           <w:noProof/>
         </w:rPr>
-        <w:instrText xml:space="preserve"> PAGEREF _Toc241158457 \h </w:instrText>
+        <w:instrText xml:space="preserve"> PAGEREF _Toc241160904 \h </w:instrText>
       </w:r>
       <w:r>
         <w:rPr>
@@ -638,7 +638,7 @@
         <w:rPr>
           <w:noProof/>
         </w:rPr>
-        <w:instrText xml:space="preserve"> PAGEREF _Toc241158458 \h </w:instrText>
+        <w:instrText xml:space="preserve"> PAGEREF _Toc241160905 \h </w:instrText>
       </w:r>
       <w:r>
         <w:rPr>
@@ -700,7 +700,7 @@
         <w:rPr>
           <w:noProof/>
         </w:rPr>
-        <w:instrText xml:space="preserve"> PAGEREF _Toc241158459 \h </w:instrText>
+        <w:instrText xml:space="preserve"> PAGEREF _Toc241160906 \h </w:instrText>
       </w:r>
       <w:r>
         <w:rPr>
@@ -762,7 +762,7 @@
         <w:rPr>
           <w:noProof/>
         </w:rPr>
-        <w:instrText xml:space="preserve"> PAGEREF _Toc241158460 \h </w:instrText>
+        <w:instrText xml:space="preserve"> PAGEREF _Toc241160907 \h </w:instrText>
       </w:r>
       <w:r>
         <w:rPr>
@@ -824,7 +824,7 @@
         <w:rPr>
           <w:noProof/>
         </w:rPr>
-        <w:instrText xml:space="preserve"> PAGEREF _Toc241158461 \h </w:instrText>
+        <w:instrText xml:space="preserve"> PAGEREF _Toc241160908 \h </w:instrText>
       </w:r>
       <w:r>
         <w:rPr>
@@ -841,7 +841,7 @@
         <w:rPr>
           <w:noProof/>
         </w:rPr>
-        <w:t>6</w:t>
+        <w:t>7</w:t>
       </w:r>
       <w:r>
         <w:rPr>
@@ -886,7 +886,7 @@
         <w:rPr>
           <w:noProof/>
         </w:rPr>
-        <w:instrText xml:space="preserve"> PAGEREF _Toc241158462 \h </w:instrText>
+        <w:instrText xml:space="preserve"> PAGEREF _Toc241160909 \h </w:instrText>
       </w:r>
       <w:r>
         <w:rPr>
@@ -948,7 +948,7 @@
         <w:rPr>
           <w:noProof/>
         </w:rPr>
-        <w:instrText xml:space="preserve"> PAGEREF _Toc241158463 \h </w:instrText>
+        <w:instrText xml:space="preserve"> PAGEREF _Toc241160910 \h </w:instrText>
       </w:r>
       <w:r>
         <w:rPr>
@@ -1010,7 +1010,7 @@
         <w:rPr>
           <w:noProof/>
         </w:rPr>
-        <w:instrText xml:space="preserve"> PAGEREF _Toc241158464 \h </w:instrText>
+        <w:instrText xml:space="preserve"> PAGEREF _Toc241160911 \h </w:instrText>
       </w:r>
       <w:r>
         <w:rPr>
@@ -1072,7 +1072,7 @@
         <w:rPr>
           <w:noProof/>
         </w:rPr>
-        <w:instrText xml:space="preserve"> PAGEREF _Toc241158465 \h </w:instrText>
+        <w:instrText xml:space="preserve"> PAGEREF _Toc241160912 \h </w:instrText>
       </w:r>
       <w:r>
         <w:rPr>
@@ -1134,7 +1134,7 @@
         <w:rPr>
           <w:noProof/>
         </w:rPr>
-        <w:instrText xml:space="preserve"> PAGEREF _Toc241158466 \h </w:instrText>
+        <w:instrText xml:space="preserve"> PAGEREF _Toc241160913 \h </w:instrText>
       </w:r>
       <w:r>
         <w:rPr>
@@ -1196,7 +1196,7 @@
         <w:rPr>
           <w:noProof/>
         </w:rPr>
-        <w:instrText xml:space="preserve"> PAGEREF _Toc241158467 \h </w:instrText>
+        <w:instrText xml:space="preserve"> PAGEREF _Toc241160914 \h </w:instrText>
       </w:r>
       <w:r>
         <w:rPr>
@@ -1258,7 +1258,7 @@
         <w:rPr>
           <w:noProof/>
         </w:rPr>
-        <w:instrText xml:space="preserve"> PAGEREF _Toc241158468 \h </w:instrText>
+        <w:instrText xml:space="preserve"> PAGEREF _Toc241160915 \h </w:instrText>
       </w:r>
       <w:r>
         <w:rPr>
@@ -1320,7 +1320,7 @@
         <w:rPr>
           <w:noProof/>
         </w:rPr>
-        <w:instrText xml:space="preserve"> PAGEREF _Toc241158469 \h </w:instrText>
+        <w:instrText xml:space="preserve"> PAGEREF _Toc241160916 \h </w:instrText>
       </w:r>
       <w:r>
         <w:rPr>
@@ -1382,7 +1382,7 @@
         <w:rPr>
           <w:noProof/>
         </w:rPr>
-        <w:instrText xml:space="preserve"> PAGEREF _Toc241158470 \h </w:instrText>
+        <w:instrText xml:space="preserve"> PAGEREF _Toc241160917 \h </w:instrText>
       </w:r>
       <w:r>
         <w:rPr>
@@ -1444,7 +1444,7 @@
         <w:rPr>
           <w:noProof/>
         </w:rPr>
-        <w:instrText xml:space="preserve"> PAGEREF _Toc241158471 \h </w:instrText>
+        <w:instrText xml:space="preserve"> PAGEREF _Toc241160918 \h </w:instrText>
       </w:r>
       <w:r>
         <w:rPr>
@@ -1506,7 +1506,7 @@
         <w:rPr>
           <w:noProof/>
         </w:rPr>
-        <w:instrText xml:space="preserve"> PAGEREF _Toc241158472 \h </w:instrText>
+        <w:instrText xml:space="preserve"> PAGEREF _Toc241160919 \h </w:instrText>
       </w:r>
       <w:r>
         <w:rPr>
@@ -1568,7 +1568,7 @@
         <w:rPr>
           <w:noProof/>
         </w:rPr>
-        <w:instrText xml:space="preserve"> PAGEREF _Toc241158473 \h </w:instrText>
+        <w:instrText xml:space="preserve"> PAGEREF _Toc241160920 \h </w:instrText>
       </w:r>
       <w:r>
         <w:rPr>
@@ -1630,7 +1630,7 @@
         <w:rPr>
           <w:noProof/>
         </w:rPr>
-        <w:instrText xml:space="preserve"> PAGEREF _Toc241158474 \h </w:instrText>
+        <w:instrText xml:space="preserve"> PAGEREF _Toc241160921 \h </w:instrText>
       </w:r>
       <w:r>
         <w:rPr>
@@ -1692,7 +1692,7 @@
         <w:rPr>
           <w:noProof/>
         </w:rPr>
-        <w:instrText xml:space="preserve"> PAGEREF _Toc241158475 \h </w:instrText>
+        <w:instrText xml:space="preserve"> PAGEREF _Toc241160922 \h </w:instrText>
       </w:r>
       <w:r>
         <w:rPr>
@@ -1754,7 +1754,7 @@
         <w:rPr>
           <w:noProof/>
         </w:rPr>
-        <w:instrText xml:space="preserve"> PAGEREF _Toc241158476 \h </w:instrText>
+        <w:instrText xml:space="preserve"> PAGEREF _Toc241160923 \h </w:instrText>
       </w:r>
       <w:r>
         <w:rPr>
@@ -1816,7 +1816,7 @@
         <w:rPr>
           <w:noProof/>
         </w:rPr>
-        <w:instrText xml:space="preserve"> PAGEREF _Toc241158477 \h </w:instrText>
+        <w:instrText xml:space="preserve"> PAGEREF _Toc241160924 \h </w:instrText>
       </w:r>
       <w:r>
         <w:rPr>
@@ -1878,7 +1878,7 @@
         <w:rPr>
           <w:noProof/>
         </w:rPr>
-        <w:instrText xml:space="preserve"> PAGEREF _Toc241158478 \h </w:instrText>
+        <w:instrText xml:space="preserve"> PAGEREF _Toc241160925 \h </w:instrText>
       </w:r>
       <w:r>
         <w:rPr>
@@ -1940,7 +1940,7 @@
         <w:rPr>
           <w:noProof/>
         </w:rPr>
-        <w:instrText xml:space="preserve"> PAGEREF _Toc241158479 \h </w:instrText>
+        <w:instrText xml:space="preserve"> PAGEREF _Toc241160926 \h </w:instrText>
       </w:r>
       <w:r>
         <w:rPr>
@@ -2002,7 +2002,7 @@
         <w:rPr>
           <w:noProof/>
         </w:rPr>
-        <w:instrText xml:space="preserve"> PAGEREF _Toc241158480 \h </w:instrText>
+        <w:instrText xml:space="preserve"> PAGEREF _Toc241160927 \h </w:instrText>
       </w:r>
       <w:r>
         <w:rPr>
@@ -2064,7 +2064,7 @@
         <w:rPr>
           <w:noProof/>
         </w:rPr>
-        <w:instrText xml:space="preserve"> PAGEREF _Toc241158481 \h </w:instrText>
+        <w:instrText xml:space="preserve"> PAGEREF _Toc241160928 \h </w:instrText>
       </w:r>
       <w:r>
         <w:rPr>
@@ -2126,7 +2126,7 @@
         <w:rPr>
           <w:noProof/>
         </w:rPr>
-        <w:instrText xml:space="preserve"> PAGEREF _Toc241158482 \h </w:instrText>
+        <w:instrText xml:space="preserve"> PAGEREF _Toc241160929 \h </w:instrText>
       </w:r>
       <w:r>
         <w:rPr>
@@ -2188,7 +2188,7 @@
         <w:rPr>
           <w:noProof/>
         </w:rPr>
-        <w:instrText xml:space="preserve"> PAGEREF _Toc241158483 \h </w:instrText>
+        <w:instrText xml:space="preserve"> PAGEREF _Toc241160930 \h </w:instrText>
       </w:r>
       <w:r>
         <w:rPr>
@@ -2250,7 +2250,7 @@
         <w:rPr>
           <w:noProof/>
         </w:rPr>
-        <w:instrText xml:space="preserve"> PAGEREF _Toc241158484 \h </w:instrText>
+        <w:instrText xml:space="preserve"> PAGEREF _Toc241160931 \h </w:instrText>
       </w:r>
       <w:r>
         <w:rPr>
@@ -2312,7 +2312,7 @@
         <w:rPr>
           <w:noProof/>
         </w:rPr>
-        <w:instrText xml:space="preserve"> PAGEREF _Toc241158485 \h </w:instrText>
+        <w:instrText xml:space="preserve"> PAGEREF _Toc241160932 \h </w:instrText>
       </w:r>
       <w:r>
         <w:rPr>
@@ -2361,10 +2361,9 @@
           <w:sz w:val="16"/>
           <w:szCs w:val="16"/>
         </w:rPr>
-        <w:lastRenderedPageBreak/>
         <w:fldChar w:fldCharType="end"/>
       </w:r>
-      <w:bookmarkStart w:id="1" w:name="_Toc241158450"/>
+      <w:bookmarkStart w:id="1" w:name="_Toc241160897"/>
     </w:p>
     <w:bookmarkEnd w:id="1"/>
     <w:p>
@@ -2713,7 +2712,7 @@
           <w:rFonts w:eastAsia="Times New Roman"/>
         </w:rPr>
       </w:pPr>
-      <w:bookmarkStart w:id="2" w:name="_Toc241158451"/>
+      <w:bookmarkStart w:id="2" w:name="_Toc241160898"/>
       <w:r>
         <w:rPr>
           <w:rFonts w:eastAsia="Times New Roman"/>
@@ -3048,7 +3047,7 @@
           <w:rFonts w:eastAsia="Times New Roman"/>
         </w:rPr>
       </w:pPr>
-      <w:bookmarkStart w:id="3" w:name="_Toc241158452"/>
+      <w:bookmarkStart w:id="3" w:name="_Toc241160899"/>
       <w:r>
         <w:rPr>
           <w:rFonts w:eastAsia="Times New Roman"/>
@@ -3223,11 +3222,12 @@
           <w:rFonts w:eastAsia="Times New Roman"/>
         </w:rPr>
       </w:pPr>
-      <w:bookmarkStart w:id="4" w:name="_Toc241158453"/>
+      <w:bookmarkStart w:id="4" w:name="_Toc241160900"/>
       <w:r>
         <w:rPr>
           <w:rFonts w:eastAsia="Times New Roman"/>
         </w:rPr>
+        <w:lastRenderedPageBreak/>
         <w:t>3 Grant of rights</w:t>
       </w:r>
       <w:bookmarkEnd w:id="4"/>
@@ -3642,7 +3642,7 @@
           <w:sz w:val="21"/>
           <w:szCs w:val="21"/>
         </w:rPr>
-        <w:t>, including after this Agreement ends. STP determines the terms of its relationship with its End Clients itself.</w:t>
+        <w:t>, including after this Agreement ends. STP determines the terms of its relationship with its End Clients itself. Where a register imposes a restriction on the use of its content, Founders1 states it with the Document.</w:t>
       </w:r>
     </w:p>
     <w:p>
@@ -3785,7 +3785,7 @@
           <w:rFonts w:eastAsia="Times New Roman"/>
         </w:rPr>
       </w:pPr>
-      <w:bookmarkStart w:id="5" w:name="_Toc241158454"/>
+      <w:bookmarkStart w:id="5" w:name="_Toc241160901"/>
       <w:r>
         <w:rPr>
           <w:rFonts w:eastAsia="Times New Roman"/>
@@ -3821,7 +3821,7 @@
           <w:rFonts w:eastAsia="Times New Roman"/>
         </w:rPr>
       </w:pPr>
-      <w:bookmarkStart w:id="6" w:name="_Toc241158455"/>
+      <w:bookmarkStart w:id="6" w:name="_Toc241160902"/>
       <w:r>
         <w:rPr>
           <w:rFonts w:eastAsia="Times New Roman"/>
@@ -3971,7 +3971,7 @@
           <w:sz w:val="21"/>
           <w:szCs w:val="21"/>
         </w:rPr>
-        <w:t>12 months</w:t>
+        <w:t>24 months</w:t>
       </w:r>
       <w:r>
         <w:rPr>
@@ -4080,7 +4080,7 @@
           <w:sz w:val="21"/>
           <w:szCs w:val="21"/>
         </w:rPr>
-        <w:t>, nor their extension to further registers.</w:t>
+        <w:t>.</w:t>
       </w:r>
     </w:p>
     <w:p>
@@ -4376,7 +4376,7 @@
           <w:rFonts w:eastAsia="Times New Roman"/>
         </w:rPr>
       </w:pPr>
-      <w:bookmarkStart w:id="7" w:name="_Toc241158456"/>
+      <w:bookmarkStart w:id="7" w:name="_Toc241160903"/>
       <w:r>
         <w:rPr>
           <w:rFonts w:eastAsia="Times New Roman"/>
@@ -4788,7 +4788,7 @@
           <w:rFonts w:eastAsia="Times New Roman"/>
         </w:rPr>
       </w:pPr>
-      <w:bookmarkStart w:id="8" w:name="_Toc241158457"/>
+      <w:bookmarkStart w:id="8" w:name="_Toc241160904"/>
       <w:r>
         <w:rPr>
           <w:rFonts w:eastAsia="Times New Roman"/>
@@ -5054,7 +5054,7 @@
           <w:rFonts w:eastAsia="Times New Roman"/>
         </w:rPr>
       </w:pPr>
-      <w:bookmarkStart w:id="9" w:name="_Toc241158458"/>
+      <w:bookmarkStart w:id="9" w:name="_Toc241160905"/>
       <w:r>
         <w:rPr>
           <w:rFonts w:eastAsia="Times New Roman"/>
@@ -5337,16 +5337,63 @@
           <w:sz w:val="21"/>
           <w:szCs w:val="21"/>
         </w:rPr>
-        <w:t>No minimum.</w:t>
-      </w:r>
-      <w:r>
-        <w:rPr>
-          <w:rFonts w:ascii="Calibri" w:eastAsia="Times New Roman" w:hAnsi="Calibri" w:cs="Calibri"/>
-          <w:color w:val="222233"/>
-          <w:sz w:val="21"/>
-          <w:szCs w:val="21"/>
-        </w:rPr>
-        <w:t xml:space="preserve"> STP owes no minimum volume and no minimum payment.</w:t>
+        <w:t>Minimum.</w:t>
+      </w:r>
+      <w:r>
+        <w:rPr>
+          <w:rFonts w:ascii="Calibri" w:eastAsia="Times New Roman" w:hAnsi="Calibri" w:cs="Calibri"/>
+          <w:color w:val="222233"/>
+          <w:sz w:val="21"/>
+          <w:szCs w:val="21"/>
+        </w:rPr>
+        <w:t xml:space="preserve"> The Fixed Fees payable for a calendar month total at least </w:t>
+      </w:r>
+      <w:r>
+        <w:rPr>
+          <w:rStyle w:val="Fett"/>
+          <w:rFonts w:ascii="Calibri" w:eastAsia="Times New Roman" w:hAnsi="Calibri" w:cs="Calibri"/>
+          <w:color w:val="222233"/>
+          <w:sz w:val="21"/>
+          <w:szCs w:val="21"/>
+        </w:rPr>
+        <w:t>EUR 750 for each of the first three full months</w:t>
+      </w:r>
+      <w:r>
+        <w:rPr>
+          <w:rFonts w:ascii="Calibri" w:eastAsia="Times New Roman" w:hAnsi="Calibri" w:cs="Calibri"/>
+          <w:color w:val="222233"/>
+          <w:sz w:val="21"/>
+          <w:szCs w:val="21"/>
+        </w:rPr>
+        <w:t xml:space="preserve"> after the effective date, and </w:t>
+      </w:r>
+      <w:r>
+        <w:rPr>
+          <w:rStyle w:val="Fett"/>
+          <w:rFonts w:ascii="Calibri" w:eastAsia="Times New Roman" w:hAnsi="Calibri" w:cs="Calibri"/>
+          <w:color w:val="222233"/>
+          <w:sz w:val="21"/>
+          <w:szCs w:val="21"/>
+        </w:rPr>
+        <w:t>EUR 1.500 per month</w:t>
+      </w:r>
+      <w:r>
+        <w:rPr>
+          <w:rFonts w:ascii="Calibri" w:eastAsia="Times New Roman" w:hAnsi="Calibri" w:cs="Calibri"/>
+          <w:color w:val="222233"/>
+          <w:sz w:val="21"/>
+          <w:szCs w:val="21"/>
+        </w:rPr>
+        <w:t xml:space="preserve"> </w:t>
+      </w:r>
+      <w:r>
+        <w:rPr>
+          <w:rFonts w:ascii="Calibri" w:eastAsia="Times New Roman" w:hAnsi="Calibri" w:cs="Calibri"/>
+          <w:color w:val="222233"/>
+          <w:sz w:val="21"/>
+          <w:szCs w:val="21"/>
+        </w:rPr>
+        <w:t>thereafter. Where they fall short, STP pays the difference in addition to the prices due for that month; where they reach the minimum, nothing further is owed. No minimum accrues for a partial first month. Any shortfall is invoiced with the following month.</w:t>
       </w:r>
     </w:p>
     <w:p>
@@ -5408,16 +5455,7 @@
           <w:sz w:val="21"/>
           <w:szCs w:val="21"/>
         </w:rPr>
-        <w:t xml:space="preserve"> </w:t>
-      </w:r>
-      <w:r>
-        <w:rPr>
-          <w:rFonts w:ascii="Calibri" w:eastAsia="Times New Roman" w:hAnsi="Calibri" w:cs="Calibri"/>
-          <w:color w:val="222233"/>
-          <w:sz w:val="21"/>
-          <w:szCs w:val="21"/>
-        </w:rPr>
-        <w:t xml:space="preserve">Founders1 invoices monthly in arrears, itemised per Case by STP's own reference. STP does not report the prices it charges its End Clients. Payment is due </w:t>
+        <w:t xml:space="preserve"> Founders1 invoices monthly in arrears, itemised per Case by STP's own reference. STP does not report the prices it charges its End Clients. Payment is due </w:t>
       </w:r>
       <w:r>
         <w:rPr>
@@ -5498,6 +5536,25 @@
           <w:sz w:val="21"/>
           <w:szCs w:val="21"/>
         </w:rPr>
+        <w:t xml:space="preserve"> (a) The Fixed Fee is fixed for the pilot term and for each renewal term. Either party may propose a different Fixed Fee for a renewal term, on the basis of the volumes of the preceding term, no later than two months before that term begins; failing agreement it remains unchanged. (b) The procurement costs in Annex 2.1 are fixed for </w:t>
+      </w:r>
+      <w:r>
+        <w:rPr>
+          <w:rStyle w:val="Fett"/>
+          <w:rFonts w:ascii="Calibri" w:eastAsia="Times New Roman" w:hAnsi="Calibri" w:cs="Calibri"/>
+          <w:color w:val="222233"/>
+          <w:sz w:val="21"/>
+          <w:szCs w:val="21"/>
+        </w:rPr>
+        <w:t>12 months</w:t>
+      </w:r>
+      <w:r>
+        <w:rPr>
+          <w:rFonts w:ascii="Calibri" w:eastAsia="Times New Roman" w:hAnsi="Calibri" w:cs="Calibri"/>
+          <w:color w:val="222233"/>
+          <w:sz w:val="21"/>
+          <w:szCs w:val="21"/>
+        </w:rPr>
         <w:t xml:space="preserve"> </w:t>
       </w:r>
       <w:r>
@@ -5507,7 +5564,7 @@
           <w:sz w:val="21"/>
           <w:szCs w:val="21"/>
         </w:rPr>
-        <w:t xml:space="preserve">(a) The Fixed Fee is fixed for the pilot term and for each renewal term. Either party may propose a different Fixed Fee for a renewal term, on the basis of the volumes of the preceding term, no later than two months before that term begins; failing agreement it remains unchanged. (b) The procurement costs in Annex 2.1 are fixed for </w:t>
+        <w:t xml:space="preserve">from the effective date, except for any jurisdiction that Annex 2.1 states is not on a tier, for which the cost is provisional until a schedule is agreed. (c) After that period, and at any time where a register or a supplier of Founders1 changes the fees it charges for a tier or jurisdiction, Founders1 may change the procurement cost for that tier or jurisdiction </w:t>
       </w:r>
       <w:r>
         <w:rPr>
@@ -5517,25 +5574,16 @@
           <w:sz w:val="21"/>
           <w:szCs w:val="21"/>
         </w:rPr>
-        <w:t>12 months</w:t>
-      </w:r>
-      <w:r>
-        <w:rPr>
-          <w:rFonts w:ascii="Calibri" w:eastAsia="Times New Roman" w:hAnsi="Calibri" w:cs="Calibri"/>
-          <w:color w:val="222233"/>
-          <w:sz w:val="21"/>
-          <w:szCs w:val="21"/>
-        </w:rPr>
-        <w:t xml:space="preserve"> </w:t>
-      </w:r>
-      <w:r>
-        <w:rPr>
-          <w:rFonts w:ascii="Calibri" w:eastAsia="Times New Roman" w:hAnsi="Calibri" w:cs="Calibri"/>
-          <w:color w:val="222233"/>
-          <w:sz w:val="21"/>
-          <w:szCs w:val="21"/>
-        </w:rPr>
-        <w:t xml:space="preserve">from the effective date, except for any jurisdiction that Annex 2.1 states is not on a tier, for which the cost is provisional until a schedule is agreed. (c) After that period, and at any time where a register or supplier changes its own fees, Founders1 may change a procurement cost </w:t>
+        <w:t>only to the extent of that change in fees</w:t>
+      </w:r>
+      <w:r>
+        <w:rPr>
+          <w:rFonts w:ascii="Calibri" w:eastAsia="Times New Roman" w:hAnsi="Calibri" w:cs="Calibri"/>
+          <w:color w:val="222233"/>
+          <w:sz w:val="21"/>
+          <w:szCs w:val="21"/>
+        </w:rPr>
+        <w:t xml:space="preserve">, on 30 days' notice and </w:t>
       </w:r>
       <w:r>
         <w:rPr>
@@ -5545,25 +5593,6 @@
           <w:sz w:val="21"/>
           <w:szCs w:val="21"/>
         </w:rPr>
-        <w:t>only to the extent that its own cost has actually changed</w:t>
-      </w:r>
-      <w:r>
-        <w:rPr>
-          <w:rFonts w:ascii="Calibri" w:eastAsia="Times New Roman" w:hAnsi="Calibri" w:cs="Calibri"/>
-          <w:color w:val="222233"/>
-          <w:sz w:val="21"/>
-          <w:szCs w:val="21"/>
-        </w:rPr>
-        <w:t xml:space="preserve">, on 30 days' notice and </w:t>
-      </w:r>
-      <w:r>
-        <w:rPr>
-          <w:rStyle w:val="Fett"/>
-          <w:rFonts w:ascii="Calibri" w:eastAsia="Times New Roman" w:hAnsi="Calibri" w:cs="Calibri"/>
-          <w:color w:val="222233"/>
-          <w:sz w:val="21"/>
-          <w:szCs w:val="21"/>
-        </w:rPr>
         <w:t>evidencing the change</w:t>
       </w:r>
       <w:r>
@@ -5573,7 +5602,7 @@
           <w:sz w:val="21"/>
           <w:szCs w:val="21"/>
         </w:rPr>
-        <w:t>. A changed procurement cost then stays fixed for at least six months, unless the register or supplier changes its fees again. (d) Where that cost falls, Founders1 lowers the procurement cost correspondingly on the same terms. (e) STP may terminate the affected jurisdiction within 14 days of a notice of increase.</w:t>
+        <w:t>. A change in the route by which Founders1 procures does not change the procurement cost. (d) Where those fees fall, Founders1 lowers the procurement cost correspondingly on the same terms. (e) STP may terminate the affected jurisdiction within 14 days of a notice of increase.</w:t>
       </w:r>
     </w:p>
     <w:p>
@@ -5654,7 +5683,7 @@
           <w:rFonts w:eastAsia="Times New Roman"/>
         </w:rPr>
       </w:pPr>
-      <w:bookmarkStart w:id="10" w:name="_Toc241158459"/>
+      <w:bookmarkStart w:id="10" w:name="_Toc241160906"/>
       <w:r>
         <w:rPr>
           <w:rFonts w:eastAsia="Times New Roman"/>
@@ -5943,16 +5972,25 @@
           <w:sz w:val="21"/>
           <w:szCs w:val="21"/>
         </w:rPr>
-        <w:t>Where an End Client is subject to supervisory requirements on outsourcing or on ICT third-party risk, STP meets those requirements towards that End Client itself. STP does not agree on Founders1's behalf, and does not represent that Founders1 has agreed, to audit or inspection rights, to disclosure of procurement routes or sub-suppliers, to exit or transition assistance, to incident-reporting or notification periods, or t</w:t>
-      </w:r>
-      <w:r>
-        <w:rPr>
-          <w:rFonts w:ascii="Calibri" w:eastAsia="Times New Roman" w:hAnsi="Calibri" w:cs="Calibri"/>
-          <w:color w:val="222233"/>
-          <w:sz w:val="21"/>
-          <w:szCs w:val="21"/>
-        </w:rPr>
-        <w:t xml:space="preserve">o entries in a register of information, unless Founders1 has agreed in writing. Founders1 will consider such a request in good faith, and will not unreasonably refuse what the End Client's supervisory position genuinely requires. Towards the End Client, </w:t>
+        <w:t>Where an End Client is subject to supervisory requirements on outsourcing or on ICT third-party risk, STP meets those requirements towards that End Client itself. STP does not agree on Founders1's behalf, and does not represent that Founders1 has agreed, to audit or inspection rights, to disclosure of procurement routes or sub-suppliers, to exit or transition assistance, to incident-reporting or notification periods, or to entries in a register of information, unless Founders1 has agreed in writing. Founder</w:t>
+      </w:r>
+      <w:r>
+        <w:rPr>
+          <w:rFonts w:ascii="Calibri" w:eastAsia="Times New Roman" w:hAnsi="Calibri" w:cs="Calibri"/>
+          <w:color w:val="222233"/>
+          <w:sz w:val="21"/>
+          <w:szCs w:val="21"/>
+        </w:rPr>
+        <w:t>s1 will consider such a request in good faith, and will not unreasonably refuse what the End Client's supervisory position genuinely requires. Towards the End Client,</w:t>
+      </w:r>
+      <w:r>
+        <w:rPr>
+          <w:rFonts w:ascii="Calibri" w:eastAsia="Times New Roman" w:hAnsi="Calibri" w:cs="Calibri"/>
+          <w:color w:val="222233"/>
+          <w:sz w:val="21"/>
+          <w:szCs w:val="21"/>
+        </w:rPr>
+        <w:t xml:space="preserve"> </w:t>
       </w:r>
       <w:r>
         <w:rPr>
@@ -6080,7 +6118,7 @@
           <w:rFonts w:eastAsia="Times New Roman"/>
         </w:rPr>
       </w:pPr>
-      <w:bookmarkStart w:id="11" w:name="_Toc241158460"/>
+      <w:bookmarkStart w:id="11" w:name="_Toc241160907"/>
       <w:r>
         <w:rPr>
           <w:rFonts w:eastAsia="Times New Roman"/>
@@ -6327,7 +6365,7 @@
           <w:rFonts w:eastAsia="Times New Roman"/>
         </w:rPr>
       </w:pPr>
-      <w:bookmarkStart w:id="12" w:name="_Toc241158461"/>
+      <w:bookmarkStart w:id="12" w:name="_Toc241160908"/>
       <w:r>
         <w:rPr>
           <w:rFonts w:eastAsia="Times New Roman"/>
@@ -6477,7 +6515,7 @@
           <w:rFonts w:eastAsia="Times New Roman"/>
         </w:rPr>
       </w:pPr>
-      <w:bookmarkStart w:id="13" w:name="_Toc241158462"/>
+      <w:bookmarkStart w:id="13" w:name="_Toc241160909"/>
       <w:r>
         <w:rPr>
           <w:rFonts w:eastAsia="Times New Roman"/>
@@ -6799,7 +6837,7 @@
           <w:rFonts w:eastAsia="Times New Roman"/>
         </w:rPr>
       </w:pPr>
-      <w:bookmarkStart w:id="14" w:name="_Toc241158463"/>
+      <w:bookmarkStart w:id="14" w:name="_Toc241160910"/>
       <w:r>
         <w:rPr>
           <w:rFonts w:eastAsia="Times New Roman"/>
@@ -6993,7 +7031,7 @@
           <w:rFonts w:eastAsia="Times New Roman"/>
         </w:rPr>
       </w:pPr>
-      <w:bookmarkStart w:id="15" w:name="_Toc241158464"/>
+      <w:bookmarkStart w:id="15" w:name="_Toc241160911"/>
       <w:r>
         <w:rPr>
           <w:rFonts w:eastAsia="Times New Roman"/>
@@ -7233,7 +7271,7 @@
           <w:sz w:val="21"/>
           <w:szCs w:val="21"/>
         </w:rPr>
-        <w:t xml:space="preserve"> Where a replacement is available only at a higher cost, clause 8.6 applies. Where a loss of supply affects jurisdictions accounting for more than half of the Cases placed in the preceding six months, either party may terminate this Agreement on 30 days' notice.</w:t>
+        <w:t xml:space="preserve"> Where a replacement is available only at a higher cost, clause 8.6 applies. Where a loss of supply affects jurisdictions accounting for more than half of the Cases placed in the preceding six months, either party may terminate this Agreement on 30 days' notice, and the minimum under clause 8.4 does not accrue after that notice.</w:t>
       </w:r>
     </w:p>
     <w:p>
@@ -7305,16 +7343,7 @@
           <w:sz w:val="21"/>
           <w:szCs w:val="21"/>
         </w:rPr>
-        <w:t xml:space="preserve"> </w:t>
-      </w:r>
-      <w:r>
-        <w:rPr>
-          <w:rFonts w:ascii="Calibri" w:hAnsi="Calibri" w:cs="Calibri"/>
-          <w:color w:val="222233"/>
-          <w:sz w:val="21"/>
-          <w:szCs w:val="21"/>
-        </w:rPr>
-        <w:t>For 90 days after termination STP may retrieve and export its Case records and the Documents delivered to it; Founders1 owes no retrieval after that period. Clauses 5, 10, 11 and 13 survive, clause 5.2 for the period stated in it, and clause 6.2a for the period stated in it.</w:t>
+        <w:t xml:space="preserve"> For 90 days after termination STP may retrieve and export its Case records and the Documents delivered to it; Founders1 owes no retrieval after that period. Clauses 5, 10, 11 and 13 survive, clause 5.2 for the period stated in it, and clause 6.2a for the period stated in it.</w:t>
       </w:r>
     </w:p>
     <w:p>
@@ -7377,7 +7406,7 @@
           <w:rFonts w:eastAsia="Times New Roman"/>
         </w:rPr>
       </w:pPr>
-      <w:bookmarkStart w:id="16" w:name="_Toc241158465"/>
+      <w:bookmarkStart w:id="16" w:name="_Toc241160912"/>
       <w:r>
         <w:rPr>
           <w:rFonts w:eastAsia="Times New Roman"/>
@@ -8151,7 +8180,7 @@
           <w:rFonts w:eastAsia="Times New Roman"/>
         </w:rPr>
       </w:pPr>
-      <w:bookmarkStart w:id="17" w:name="_Toc241158466"/>
+      <w:bookmarkStart w:id="17" w:name="_Toc241160913"/>
       <w:r>
         <w:rPr>
           <w:rFonts w:eastAsia="Times New Roman"/>
@@ -8350,7 +8379,7 @@
           <w:rFonts w:eastAsia="Times New Roman"/>
         </w:rPr>
       </w:pPr>
-      <w:bookmarkStart w:id="18" w:name="_Toc241158467"/>
+      <w:bookmarkStart w:id="18" w:name="_Toc241160914"/>
       <w:r>
         <w:rPr>
           <w:rFonts w:eastAsia="Times New Roman"/>
@@ -8380,7 +8409,7 @@
           <w:rFonts w:eastAsia="Times New Roman"/>
         </w:rPr>
       </w:pPr>
-      <w:bookmarkStart w:id="19" w:name="_Toc241158468"/>
+      <w:bookmarkStart w:id="19" w:name="_Toc241160915"/>
       <w:r>
         <w:rPr>
           <w:rFonts w:eastAsia="Times New Roman"/>
@@ -8624,7 +8653,7 @@
           <w:rFonts w:eastAsia="Times New Roman"/>
         </w:rPr>
       </w:pPr>
-      <w:bookmarkStart w:id="20" w:name="_Toc241158469"/>
+      <w:bookmarkStart w:id="20" w:name="_Toc241160916"/>
       <w:r>
         <w:rPr>
           <w:rFonts w:eastAsia="Times New Roman"/>
@@ -9166,7 +9195,7 @@
           <w:rFonts w:eastAsia="Times New Roman"/>
         </w:rPr>
       </w:pPr>
-      <w:bookmarkStart w:id="21" w:name="_Toc241158470"/>
+      <w:bookmarkStart w:id="21" w:name="_Toc241160917"/>
       <w:r>
         <w:rPr>
           <w:rFonts w:eastAsia="Times New Roman"/>
@@ -9825,7 +9854,7 @@
           <w:rFonts w:eastAsia="Times New Roman"/>
         </w:rPr>
       </w:pPr>
-      <w:bookmarkStart w:id="22" w:name="_Toc241158471"/>
+      <w:bookmarkStart w:id="22" w:name="_Toc241160918"/>
       <w:r>
         <w:rPr>
           <w:rFonts w:eastAsia="Times New Roman"/>
@@ -10164,7 +10193,16 @@
           <w:sz w:val="21"/>
           <w:szCs w:val="21"/>
         </w:rPr>
-        <w:t>STP retrieves the documents and their provenance from BetterCo and files them in the client's file. Case and document identifiers are BetterCo identifiers and stay stable across a change of source.</w:t>
+        <w:t xml:space="preserve">STP retrieves the documents and </w:t>
+      </w:r>
+      <w:r>
+        <w:rPr>
+          <w:rFonts w:ascii="Calibri" w:eastAsia="Times New Roman" w:hAnsi="Calibri" w:cs="Calibri"/>
+          <w:color w:val="222233"/>
+          <w:sz w:val="21"/>
+          <w:szCs w:val="21"/>
+        </w:rPr>
+        <w:t>their provenance from BetterCo and files them in the client's file. Case and document identifiers are BetterCo identifiers and stay stable across a change of source.</w:t>
       </w:r>
     </w:p>
     <w:p>
@@ -10335,7 +10373,7 @@
           <w:rFonts w:eastAsia="Times New Roman"/>
         </w:rPr>
       </w:pPr>
-      <w:bookmarkStart w:id="23" w:name="_Toc241158472"/>
+      <w:bookmarkStart w:id="23" w:name="_Toc241160919"/>
       <w:r>
         <w:rPr>
           <w:rFonts w:eastAsia="Times New Roman"/>
@@ -10365,7 +10403,7 @@
           <w:rFonts w:eastAsia="Times New Roman"/>
         </w:rPr>
       </w:pPr>
-      <w:bookmarkStart w:id="24" w:name="_Toc241158473"/>
+      <w:bookmarkStart w:id="24" w:name="_Toc241160920"/>
       <w:r>
         <w:rPr>
           <w:rFonts w:eastAsia="Times New Roman"/>
@@ -11506,7 +11544,7 @@
           <w:rFonts w:eastAsia="Times New Roman"/>
         </w:rPr>
       </w:pPr>
-      <w:bookmarkStart w:id="25" w:name="_Toc241158474"/>
+      <w:bookmarkStart w:id="25" w:name="_Toc241160921"/>
       <w:r>
         <w:rPr>
           <w:rFonts w:eastAsia="Times New Roman"/>
@@ -11577,7 +11615,7 @@
     </w:p>
     <w:p>
       <w:pPr>
-        <w:divId w:val="1404571554"/>
+        <w:divId w:val="1133988642"/>
         <w:rPr>
           <w:rFonts w:ascii="Calibri" w:eastAsia="Times New Roman" w:hAnsi="Calibri" w:cs="Calibri"/>
           <w:color w:val="222233"/>
@@ -11626,7 +11664,7 @@
     </w:p>
     <w:p>
       <w:pPr>
-        <w:divId w:val="1343781364"/>
+        <w:divId w:val="59402598"/>
         <w:rPr>
           <w:rFonts w:ascii="Calibri" w:eastAsia="Times New Roman" w:hAnsi="Calibri" w:cs="Calibri"/>
           <w:color w:val="222233"/>
@@ -11666,7 +11704,7 @@
     </w:p>
     <w:p>
       <w:pPr>
-        <w:divId w:val="789977365"/>
+        <w:divId w:val="639770735"/>
         <w:rPr>
           <w:rFonts w:ascii="Calibri" w:eastAsia="Times New Roman" w:hAnsi="Calibri" w:cs="Calibri"/>
           <w:color w:val="222233"/>
@@ -11706,7 +11744,7 @@
     </w:p>
     <w:p>
       <w:pPr>
-        <w:divId w:val="1549340520"/>
+        <w:divId w:val="1306275250"/>
         <w:rPr>
           <w:rFonts w:ascii="Calibri" w:eastAsia="Times New Roman" w:hAnsi="Calibri" w:cs="Calibri"/>
           <w:color w:val="222233"/>
@@ -11746,7 +11784,7 @@
     </w:p>
     <w:p>
       <w:pPr>
-        <w:divId w:val="255753408"/>
+        <w:divId w:val="387345994"/>
         <w:rPr>
           <w:rFonts w:ascii="Calibri" w:eastAsia="Times New Roman" w:hAnsi="Calibri" w:cs="Calibri"/>
           <w:color w:val="222233"/>
@@ -11786,7 +11824,7 @@
     </w:p>
     <w:p>
       <w:pPr>
-        <w:divId w:val="213010818"/>
+        <w:divId w:val="638190710"/>
         <w:rPr>
           <w:rFonts w:ascii="Calibri" w:eastAsia="Times New Roman" w:hAnsi="Calibri" w:cs="Calibri"/>
           <w:color w:val="222233"/>
@@ -11826,7 +11864,7 @@
     </w:p>
     <w:p>
       <w:pPr>
-        <w:divId w:val="480656465"/>
+        <w:divId w:val="1020204757"/>
         <w:rPr>
           <w:rFonts w:ascii="Calibri" w:eastAsia="Times New Roman" w:hAnsi="Calibri" w:cs="Calibri"/>
           <w:color w:val="222233"/>
@@ -11986,7 +12024,7 @@
           <w:rFonts w:eastAsia="Times New Roman"/>
         </w:rPr>
       </w:pPr>
-      <w:bookmarkStart w:id="26" w:name="_Toc241158475"/>
+      <w:bookmarkStart w:id="26" w:name="_Toc241160922"/>
       <w:r>
         <w:rPr>
           <w:rFonts w:eastAsia="Times New Roman"/>
@@ -12002,7 +12040,7 @@
           <w:rFonts w:eastAsia="Times New Roman"/>
         </w:rPr>
       </w:pPr>
-      <w:bookmarkStart w:id="27" w:name="_Toc241158476"/>
+      <w:bookmarkStart w:id="27" w:name="_Toc241160923"/>
       <w:r>
         <w:rPr>
           <w:rFonts w:eastAsia="Times New Roman"/>
@@ -12217,7 +12255,7 @@
           <w:rFonts w:eastAsia="Times New Roman"/>
         </w:rPr>
       </w:pPr>
-      <w:bookmarkStart w:id="28" w:name="_Toc241158477"/>
+      <w:bookmarkStart w:id="28" w:name="_Toc241160924"/>
       <w:r>
         <w:rPr>
           <w:rFonts w:eastAsia="Times New Roman"/>
@@ -12253,7 +12291,7 @@
           <w:rFonts w:eastAsia="Times New Roman"/>
         </w:rPr>
       </w:pPr>
-      <w:bookmarkStart w:id="29" w:name="_Toc241158478"/>
+      <w:bookmarkStart w:id="29" w:name="_Toc241160925"/>
       <w:r>
         <w:rPr>
           <w:rFonts w:eastAsia="Times New Roman"/>
@@ -12279,7 +12317,16 @@
           <w:sz w:val="21"/>
           <w:szCs w:val="21"/>
         </w:rPr>
-        <w:t>What an End Client may do with a Document is set out in clause 3.5. STP determines its terms with End Clients itself.</w:t>
+        <w:t>W</w:t>
+      </w:r>
+      <w:r>
+        <w:rPr>
+          <w:rFonts w:ascii="Calibri" w:hAnsi="Calibri" w:cs="Calibri"/>
+          <w:color w:val="222233"/>
+          <w:sz w:val="21"/>
+          <w:szCs w:val="21"/>
+        </w:rPr>
+        <w:t>hat an End Client may do with a Document is set out in clause 3.5. STP determines its terms with End Clients itself.</w:t>
       </w:r>
     </w:p>
     <w:p>
@@ -12324,7 +12371,7 @@
           <w:rFonts w:eastAsia="Times New Roman"/>
         </w:rPr>
       </w:pPr>
-      <w:bookmarkStart w:id="30" w:name="_Toc241158479"/>
+      <w:bookmarkStart w:id="30" w:name="_Toc241160926"/>
       <w:r>
         <w:rPr>
           <w:rFonts w:eastAsia="Times New Roman"/>
@@ -12354,7 +12401,7 @@
           <w:rFonts w:eastAsia="Times New Roman"/>
         </w:rPr>
       </w:pPr>
-      <w:bookmarkStart w:id="31" w:name="_Toc241158480"/>
+      <w:bookmarkStart w:id="31" w:name="_Toc241160927"/>
       <w:r>
         <w:rPr>
           <w:rFonts w:eastAsia="Times New Roman"/>
@@ -12399,16 +12446,16 @@
           <w:sz w:val="21"/>
           <w:szCs w:val="21"/>
         </w:rPr>
-        <w:t xml:space="preserve"> under Art. 4 No. 7 GDPR. Neither party processes on behalf </w:t>
-      </w:r>
-      <w:r>
-        <w:rPr>
-          <w:rFonts w:ascii="Calibri" w:hAnsi="Calibri" w:cs="Calibri"/>
-          <w:color w:val="222233"/>
-          <w:sz w:val="21"/>
-          <w:szCs w:val="21"/>
-        </w:rPr>
-        <w:t>of the other; Art. 28 GDPR does not apply, and no joint controllership under Art. 26 GDPR is established. Each party is separately responsible for the lawfulness of its own processing.</w:t>
+        <w:t xml:space="preserve"> </w:t>
+      </w:r>
+      <w:r>
+        <w:rPr>
+          <w:rFonts w:ascii="Calibri" w:hAnsi="Calibri" w:cs="Calibri"/>
+          <w:color w:val="222233"/>
+          <w:sz w:val="21"/>
+          <w:szCs w:val="21"/>
+        </w:rPr>
+        <w:t>under Art. 4 No. 7 GDPR. Neither party processes on behalf of the other; Art. 28 GDPR does not apply, and no joint controllership under Art. 26 GDPR is established. Each party is separately responsible for the lawfulness of its own processing.</w:t>
       </w:r>
     </w:p>
     <w:p>
@@ -12467,7 +12514,16 @@
           <w:sz w:val="21"/>
           <w:szCs w:val="21"/>
         </w:rPr>
-        <w:t xml:space="preserve"> (clause 14.4). It therefore processes for its own purposes and on its own determination, and not solely on STP's instruction, which is what distinguishes this arrangement from processing under Art. 28 GDPR.</w:t>
+        <w:t xml:space="preserve"> </w:t>
+      </w:r>
+      <w:r>
+        <w:rPr>
+          <w:rFonts w:ascii="Calibri" w:hAnsi="Calibri" w:cs="Calibri"/>
+          <w:color w:val="222233"/>
+          <w:sz w:val="21"/>
+          <w:szCs w:val="21"/>
+        </w:rPr>
+        <w:t>(clause 14.4). It therefore processes for its own purposes and on its own determination, and not solely on STP's instruction, which is what distinguishes this arrangement from processing under Art. 28 GDPR.</w:t>
       </w:r>
     </w:p>
     <w:p>
@@ -12477,7 +12533,7 @@
           <w:rFonts w:eastAsia="Times New Roman"/>
         </w:rPr>
       </w:pPr>
-      <w:bookmarkStart w:id="32" w:name="_Toc241158481"/>
+      <w:bookmarkStart w:id="32" w:name="_Toc241160928"/>
       <w:r>
         <w:rPr>
           <w:rFonts w:eastAsia="Times New Roman"/>
@@ -12898,7 +12954,7 @@
           <w:rFonts w:eastAsia="Times New Roman"/>
         </w:rPr>
       </w:pPr>
-      <w:bookmarkStart w:id="33" w:name="_Toc241158482"/>
+      <w:bookmarkStart w:id="33" w:name="_Toc241160929"/>
       <w:r>
         <w:rPr>
           <w:rFonts w:eastAsia="Times New Roman"/>
@@ -12954,7 +13010,7 @@
           <w:rFonts w:eastAsia="Times New Roman"/>
         </w:rPr>
       </w:pPr>
-      <w:bookmarkStart w:id="34" w:name="_Toc241158483"/>
+      <w:bookmarkStart w:id="34" w:name="_Toc241160930"/>
       <w:r>
         <w:rPr>
           <w:rFonts w:eastAsia="Times New Roman"/>
@@ -13114,7 +13170,7 @@
           <w:rFonts w:eastAsia="Times New Roman"/>
         </w:rPr>
       </w:pPr>
-      <w:bookmarkStart w:id="35" w:name="_Toc241158484"/>
+      <w:bookmarkStart w:id="35" w:name="_Toc241160931"/>
       <w:r>
         <w:rPr>
           <w:rFonts w:eastAsia="Times New Roman"/>
@@ -13316,7 +13372,7 @@
           <w:rFonts w:eastAsia="Times New Roman"/>
         </w:rPr>
       </w:pPr>
-      <w:bookmarkStart w:id="36" w:name="_Toc241158485"/>
+      <w:bookmarkStart w:id="36" w:name="_Toc241160932"/>
       <w:r>
         <w:rPr>
           <w:rFonts w:eastAsia="Times New Roman"/>
@@ -13358,9 +13414,9 @@
 <file path=word/numbering.xml><?xml version="1.0" encoding="utf-8"?>
 <w:numbering xmlns:wpc="http://schemas.microsoft.com/office/word/2010/wordprocessingCanvas" xmlns:cx="http://schemas.microsoft.com/office/drawing/2014/chartex" xmlns:cx1="http://schemas.microsoft.com/office/drawing/2015/9/8/chartex" xmlns:cx2="http://schemas.microsoft.com/office/drawing/2015/10/21/chartex" xmlns:cx3="http://schemas.microsoft.com/office/drawing/2016/5/9/chartex" xmlns:cx4="http://schemas.microsoft.com/office/drawing/2016/5/10/chartex" xmlns:cx5="http://schemas.microsoft.com/office/drawing/2016/5/11/chartex" xmlns:cx6="http://schemas.microsoft.com/office/drawing/2016/5/12/chartex" xmlns:cx7="http://schemas.microsoft.com/office/drawing/2016/5/13/chartex" xmlns:cx8="http://schemas.microsoft.com/office/drawing/2016/5/14/chartex" xmlns:mc="http://schemas.openxmlformats.org/markup-compatibility/2006" xmlns:aink="http://schemas.microsoft.com/office/drawing/2016/ink" xmlns:am3d="http://schemas.microsoft.com/office/drawing/2017/model3d" xmlns:o="urn:schemas-microsoft-com:office:office" xmlns:oel="http://schemas.microsoft.com/office/2019/extlst" xmlns:r="http://schemas.openxmlformats.org/officeDocument/2006/relationships" xmlns:m="http://schemas.openxmlformats.org/officeDocument/2006/math" xmlns:v="urn:schemas-microsoft-com:vml" xmlns:wp14="http://schemas.microsoft.com/office/word/2010/wordprocessingDrawing" xmlns:wp="http://schemas.openxmlformats.org/drawingml/2006/wordprocessingDrawing" xmlns:w10="urn:schemas-microsoft-com:office:word" xmlns:w="http://schemas.openxmlformats.org/wordprocessingml/2006/main" xmlns:w14="http://schemas.microsoft.com/office/word/2010/wordml" xmlns:w15="http://schemas.microsoft.com/office/word/2012/wordml" xmlns:w16cex="http://schemas.microsoft.com/office/word/2018/wordml/cex" xmlns:w16cid="http://schemas.microsoft.com/office/word/2016/wordml/cid" xmlns:w16="http://schemas.microsoft.com/office/word/2018/wordml" xmlns:w16du="http://schemas.microsoft.com/office/word/2023/wordml/word16du" xmlns:w16sdtdh="http://schemas.microsoft.com/office/word/2020/wordml/sdtdatahash" xmlns:w16sdtfl="http://schemas.microsoft.com/office/word/2024/wordml/sdtformatlock" xmlns:w16se="http://schemas.microsoft.com/office/word/2015/wordml/symex" xmlns:wpg="http://schemas.microsoft.com/office/word/2010/wordprocessingGroup" xmlns:wpi="http://schemas.microsoft.com/office/word/2010/wordprocessingInk" xmlns:wne="http://schemas.microsoft.com/office/word/2006/wordml" xmlns:wps="http://schemas.microsoft.com/office/word/2010/wordprocessingShape" mc:Ignorable="w14 w15 w16se w16cid w16 w16cex w16sdtdh w16sdtfl w16du wp14">
   <w:abstractNum w:abstractNumId="0" w15:restartNumberingAfterBreak="0">
-    <w:nsid w:val="1C85565C"/>
+    <w:nsid w:val="1AA31ECC"/>
     <w:multiLevelType w:val="multilevel"/>
-    <w:tmpl w:val="9BB636F8"/>
+    <w:tmpl w:val="01A6974C"/>
     <w:lvl w:ilvl="0">
       <w:start w:val="1"/>
       <w:numFmt w:val="bullet"/>
@@ -13507,9 +13563,126 @@
     </w:lvl>
   </w:abstractNum>
   <w:abstractNum w:abstractNumId="1" w15:restartNumberingAfterBreak="0">
-    <w:nsid w:val="413F43EA"/>
+    <w:nsid w:val="1C7B4DEF"/>
     <w:multiLevelType w:val="multilevel"/>
-    <w:tmpl w:val="69A2DD70"/>
+    <w:tmpl w:val="1C321748"/>
+    <w:lvl w:ilvl="0">
+      <w:start w:val="1"/>
+      <w:numFmt w:val="decimal"/>
+      <w:lvlText w:val="%1."/>
+      <w:lvlJc w:val="left"/>
+      <w:pPr>
+        <w:tabs>
+          <w:tab w:val="num" w:pos="720"/>
+        </w:tabs>
+        <w:ind w:left="720" w:hanging="360"/>
+      </w:pPr>
+    </w:lvl>
+    <w:lvl w:ilvl="1">
+      <w:start w:val="1"/>
+      <w:numFmt w:val="bullet"/>
+      <w:lvlText w:val="o"/>
+      <w:lvlJc w:val="left"/>
+      <w:pPr>
+        <w:tabs>
+          <w:tab w:val="num" w:pos="1440"/>
+        </w:tabs>
+        <w:ind w:left="1440" w:hanging="360"/>
+      </w:pPr>
+      <w:rPr>
+        <w:rFonts w:ascii="Courier New" w:hAnsi="Courier New" w:hint="default"/>
+        <w:sz w:val="20"/>
+      </w:rPr>
+    </w:lvl>
+    <w:lvl w:ilvl="2" w:tentative="1">
+      <w:start w:val="1"/>
+      <w:numFmt w:val="decimal"/>
+      <w:lvlText w:val="%3."/>
+      <w:lvlJc w:val="left"/>
+      <w:pPr>
+        <w:tabs>
+          <w:tab w:val="num" w:pos="2160"/>
+        </w:tabs>
+        <w:ind w:left="2160" w:hanging="360"/>
+      </w:pPr>
+    </w:lvl>
+    <w:lvl w:ilvl="3" w:tentative="1">
+      <w:start w:val="1"/>
+      <w:numFmt w:val="decimal"/>
+      <w:lvlText w:val="%4."/>
+      <w:lvlJc w:val="left"/>
+      <w:pPr>
+        <w:tabs>
+          <w:tab w:val="num" w:pos="2880"/>
+        </w:tabs>
+        <w:ind w:left="2880" w:hanging="360"/>
+      </w:pPr>
+    </w:lvl>
+    <w:lvl w:ilvl="4" w:tentative="1">
+      <w:start w:val="1"/>
+      <w:numFmt w:val="decimal"/>
+      <w:lvlText w:val="%5."/>
+      <w:lvlJc w:val="left"/>
+      <w:pPr>
+        <w:tabs>
+          <w:tab w:val="num" w:pos="3600"/>
+        </w:tabs>
+        <w:ind w:left="3600" w:hanging="360"/>
+      </w:pPr>
+    </w:lvl>
+    <w:lvl w:ilvl="5" w:tentative="1">
+      <w:start w:val="1"/>
+      <w:numFmt w:val="decimal"/>
+      <w:lvlText w:val="%6."/>
+      <w:lvlJc w:val="left"/>
+      <w:pPr>
+        <w:tabs>
+          <w:tab w:val="num" w:pos="4320"/>
+        </w:tabs>
+        <w:ind w:left="4320" w:hanging="360"/>
+      </w:pPr>
+    </w:lvl>
+    <w:lvl w:ilvl="6" w:tentative="1">
+      <w:start w:val="1"/>
+      <w:numFmt w:val="decimal"/>
+      <w:lvlText w:val="%7."/>
+      <w:lvlJc w:val="left"/>
+      <w:pPr>
+        <w:tabs>
+          <w:tab w:val="num" w:pos="5040"/>
+        </w:tabs>
+        <w:ind w:left="5040" w:hanging="360"/>
+      </w:pPr>
+    </w:lvl>
+    <w:lvl w:ilvl="7" w:tentative="1">
+      <w:start w:val="1"/>
+      <w:numFmt w:val="decimal"/>
+      <w:lvlText w:val="%8."/>
+      <w:lvlJc w:val="left"/>
+      <w:pPr>
+        <w:tabs>
+          <w:tab w:val="num" w:pos="5760"/>
+        </w:tabs>
+        <w:ind w:left="5760" w:hanging="360"/>
+      </w:pPr>
+    </w:lvl>
+    <w:lvl w:ilvl="8" w:tentative="1">
+      <w:start w:val="1"/>
+      <w:numFmt w:val="decimal"/>
+      <w:lvlText w:val="%9."/>
+      <w:lvlJc w:val="left"/>
+      <w:pPr>
+        <w:tabs>
+          <w:tab w:val="num" w:pos="6480"/>
+        </w:tabs>
+        <w:ind w:left="6480" w:hanging="360"/>
+      </w:pPr>
+    </w:lvl>
+  </w:abstractNum>
+  <w:abstractNum w:abstractNumId="2" w15:restartNumberingAfterBreak="0">
+    <w:nsid w:val="5DD040B2"/>
+    <w:multiLevelType w:val="multilevel"/>
+    <w:tmpl w:val="38080960"/>
     <w:lvl w:ilvl="0">
       <w:start w:val="1"/>
       <w:numFmt w:val="bullet"/>
@@ -13655,10 +13828,10 @@
       </w:rPr>
     </w:lvl>
   </w:abstractNum>
-  <w:abstractNum w:abstractNumId="2" w15:restartNumberingAfterBreak="0">
-    <w:nsid w:val="577E4BA3"/>
+  <w:abstractNum w:abstractNumId="3" w15:restartNumberingAfterBreak="0">
+    <w:nsid w:val="716E4FD7"/>
     <w:multiLevelType w:val="multilevel"/>
-    <w:tmpl w:val="45C61394"/>
+    <w:tmpl w:val="6CC099C2"/>
     <w:lvl w:ilvl="0">
       <w:start w:val="1"/>
       <w:numFmt w:val="bullet"/>
@@ -13804,127 +13977,10 @@
       </w:rPr>
     </w:lvl>
   </w:abstractNum>
-  <w:abstractNum w:abstractNumId="3" w15:restartNumberingAfterBreak="0">
-    <w:nsid w:val="5C9473D3"/>
+  <w:abstractNum w:abstractNumId="4" w15:restartNumberingAfterBreak="0">
+    <w:nsid w:val="77FA787C"/>
     <w:multiLevelType w:val="multilevel"/>
-    <w:tmpl w:val="907ED83A"/>
-    <w:lvl w:ilvl="0">
-      <w:start w:val="1"/>
-      <w:numFmt w:val="decimal"/>
-      <w:lvlText w:val="%1."/>
-      <w:lvlJc w:val="left"/>
-      <w:pPr>
-        <w:tabs>
-          <w:tab w:val="num" w:pos="720"/>
-        </w:tabs>
-        <w:ind w:left="720" w:hanging="360"/>
-      </w:pPr>
-    </w:lvl>
-    <w:lvl w:ilvl="1">
-      <w:start w:val="1"/>
-      <w:numFmt w:val="bullet"/>
-      <w:lvlText w:val="o"/>
-      <w:lvlJc w:val="left"/>
-      <w:pPr>
-        <w:tabs>
-          <w:tab w:val="num" w:pos="1440"/>
-        </w:tabs>
-        <w:ind w:left="1440" w:hanging="360"/>
-      </w:pPr>
-      <w:rPr>
-        <w:rFonts w:ascii="Courier New" w:hAnsi="Courier New" w:hint="default"/>
-        <w:sz w:val="20"/>
-      </w:rPr>
-    </w:lvl>
-    <w:lvl w:ilvl="2" w:tentative="1">
-      <w:start w:val="1"/>
-      <w:numFmt w:val="decimal"/>
-      <w:lvlText w:val="%3."/>
-      <w:lvlJc w:val="left"/>
-      <w:pPr>
-        <w:tabs>
-          <w:tab w:val="num" w:pos="2160"/>
-        </w:tabs>
-        <w:ind w:left="2160" w:hanging="360"/>
-      </w:pPr>
-    </w:lvl>
-    <w:lvl w:ilvl="3" w:tentative="1">
-      <w:start w:val="1"/>
-      <w:numFmt w:val="decimal"/>
-      <w:lvlText w:val="%4."/>
-      <w:lvlJc w:val="left"/>
-      <w:pPr>
-        <w:tabs>
-          <w:tab w:val="num" w:pos="2880"/>
-        </w:tabs>
-        <w:ind w:left="2880" w:hanging="360"/>
-      </w:pPr>
-    </w:lvl>
-    <w:lvl w:ilvl="4" w:tentative="1">
-      <w:start w:val="1"/>
-      <w:numFmt w:val="decimal"/>
-      <w:lvlText w:val="%5."/>
-      <w:lvlJc w:val="left"/>
-      <w:pPr>
-        <w:tabs>
-          <w:tab w:val="num" w:pos="3600"/>
-        </w:tabs>
-        <w:ind w:left="3600" w:hanging="360"/>
-      </w:pPr>
-    </w:lvl>
-    <w:lvl w:ilvl="5" w:tentative="1">
-      <w:start w:val="1"/>
-      <w:numFmt w:val="decimal"/>
-      <w:lvlText w:val="%6."/>
-      <w:lvlJc w:val="left"/>
-      <w:pPr>
-        <w:tabs>
-          <w:tab w:val="num" w:pos="4320"/>
-        </w:tabs>
-        <w:ind w:left="4320" w:hanging="360"/>
-      </w:pPr>
-    </w:lvl>
-    <w:lvl w:ilvl="6" w:tentative="1">
-      <w:start w:val="1"/>
-      <w:numFmt w:val="decimal"/>
-      <w:lvlText w:val="%7."/>
-      <w:lvlJc w:val="left"/>
-      <w:pPr>
-        <w:tabs>
-          <w:tab w:val="num" w:pos="5040"/>
-        </w:tabs>
-        <w:ind w:left="5040" w:hanging="360"/>
-      </w:pPr>
-    </w:lvl>
-    <w:lvl w:ilvl="7" w:tentative="1">
-      <w:start w:val="1"/>
-      <w:numFmt w:val="decimal"/>
-      <w:lvlText w:val="%8."/>
-      <w:lvlJc w:val="left"/>
-      <w:pPr>
-        <w:tabs>
-          <w:tab w:val="num" w:pos="5760"/>
-        </w:tabs>
-        <w:ind w:left="5760" w:hanging="360"/>
-      </w:pPr>
-    </w:lvl>
-    <w:lvl w:ilvl="8" w:tentative="1">
-      <w:start w:val="1"/>
-      <w:numFmt w:val="decimal"/>
-      <w:lvlText w:val="%9."/>
-      <w:lvlJc w:val="left"/>
-      <w:pPr>
-        <w:tabs>
-          <w:tab w:val="num" w:pos="6480"/>
-        </w:tabs>
-        <w:ind w:left="6480" w:hanging="360"/>
-      </w:pPr>
-    </w:lvl>
-  </w:abstractNum>
-  <w:abstractNum w:abstractNumId="4" w15:restartNumberingAfterBreak="0">
-    <w:nsid w:val="77C4650C"/>
-    <w:multiLevelType w:val="multilevel"/>
-    <w:tmpl w:val="8E889CEC"/>
+    <w:tmpl w:val="E5849EC0"/>
     <w:lvl w:ilvl="0">
       <w:start w:val="1"/>
       <w:numFmt w:val="bullet"/>
@@ -14070,20 +14126,20 @@
       </w:rPr>
     </w:lvl>
   </w:abstractNum>
-  <w:num w:numId="1" w16cid:durableId="1244873137">
-    <w:abstractNumId w:val="2"/>
+  <w:num w:numId="1" w16cid:durableId="1832481435">
+    <w:abstractNumId w:val="0"/>
   </w:num>
-  <w:num w:numId="2" w16cid:durableId="1429932144">
+  <w:num w:numId="2" w16cid:durableId="1455102621">
+    <w:abstractNumId w:val="1"/>
+  </w:num>
+  <w:num w:numId="3" w16cid:durableId="177280763">
     <w:abstractNumId w:val="3"/>
   </w:num>
-  <w:num w:numId="3" w16cid:durableId="248731761">
-    <w:abstractNumId w:val="0"/>
-  </w:num>
-  <w:num w:numId="4" w16cid:durableId="1045570173">
+  <w:num w:numId="4" w16cid:durableId="1789734583">
     <w:abstractNumId w:val="4"/>
   </w:num>
-  <w:num w:numId="5" w16cid:durableId="1758137973">
-    <w:abstractNumId w:val="1"/>
+  <w:num w:numId="5" w16cid:durableId="28117849">
+    <w:abstractNumId w:val="2"/>
   </w:num>
 </w:numbering>
 </file>
@@ -14704,7 +14760,7 @@
     <w:autoRedefine/>
     <w:uiPriority w:val="39"/>
     <w:unhideWhenUsed/>
-    <w:rsid w:val="00993A90"/>
+    <w:rsid w:val="0030774D"/>
     <w:pPr>
       <w:spacing w:after="100"/>
     </w:pPr>
@@ -14716,7 +14772,7 @@
     <w:autoRedefine/>
     <w:uiPriority w:val="39"/>
     <w:unhideWhenUsed/>
-    <w:rsid w:val="00993A90"/>
+    <w:rsid w:val="0030774D"/>
     <w:pPr>
       <w:spacing w:after="100"/>
       <w:ind w:left="240"/>
@@ -14727,7 +14783,7 @@
     <w:hidden/>
     <w:uiPriority w:val="99"/>
     <w:semiHidden/>
-    <w:rsid w:val="00993A90"/>
+    <w:rsid w:val="0030774D"/>
     <w:rPr>
       <w:rFonts w:eastAsiaTheme="minorEastAsia"/>
       <w:sz w:val="24"/>

</xml_diff>

<commit_message>
Septeo Draft 2: Austria stays in Annex 2
Fabian Puls (STP) asked on 25.09. not to remove Austria - STP needs the
documents. Only Germany is excluded now (152 jurisdictions); the backend
already refuses only DE. Reply to comment #17 says so.

Co-Authored-By: Claude Opus 5.5 (1M context) <noreply@anthropic.com>
</commit_message>
<xml_diff>
--- a/docs/SEPTEO_RESELLER_AGREEMENT_DRAFT2_2026-09-24.docx
+++ b/docs/SEPTEO_RESELLER_AGREEMENT_DRAFT2_2026-09-24.docx
@@ -6,7 +6,7 @@
       <w:pPr>
         <w:pStyle w:val="berschrift1"/>
       </w:pPr>
-      <w:bookmarkStart w:id="0" w:name="_Toc241160896"/>
+      <w:bookmarkStart w:id="0" w:name="_Toc241436690"/>
       <w:r>
         <w:t>Contents</w:t>
       </w:r>
@@ -80,7 +80,7 @@
         <w:rPr>
           <w:noProof/>
         </w:rPr>
-        <w:instrText xml:space="preserve"> PAGEREF _Toc241160896 \h </w:instrText>
+        <w:instrText xml:space="preserve"> PAGEREF _Toc241436690 \h </w:instrText>
       </w:r>
       <w:r>
         <w:rPr>
@@ -142,7 +142,7 @@
         <w:rPr>
           <w:noProof/>
         </w:rPr>
-        <w:instrText xml:space="preserve"> PAGEREF _Toc241160897 \h </w:instrText>
+        <w:instrText xml:space="preserve"> PAGEREF _Toc241436691 \h </w:instrText>
       </w:r>
       <w:r>
         <w:rPr>
@@ -204,7 +204,7 @@
         <w:rPr>
           <w:noProof/>
         </w:rPr>
-        <w:instrText xml:space="preserve"> PAGEREF _Toc241160898 \h </w:instrText>
+        <w:instrText xml:space="preserve"> PAGEREF _Toc241436692 \h </w:instrText>
       </w:r>
       <w:r>
         <w:rPr>
@@ -266,7 +266,7 @@
         <w:rPr>
           <w:noProof/>
         </w:rPr>
-        <w:instrText xml:space="preserve"> PAGEREF _Toc241160899 \h </w:instrText>
+        <w:instrText xml:space="preserve"> PAGEREF _Toc241436693 \h </w:instrText>
       </w:r>
       <w:r>
         <w:rPr>
@@ -328,7 +328,7 @@
         <w:rPr>
           <w:noProof/>
         </w:rPr>
-        <w:instrText xml:space="preserve"> PAGEREF _Toc241160900 \h </w:instrText>
+        <w:instrText xml:space="preserve"> PAGEREF _Toc241436694 \h </w:instrText>
       </w:r>
       <w:r>
         <w:rPr>
@@ -390,7 +390,7 @@
         <w:rPr>
           <w:noProof/>
         </w:rPr>
-        <w:instrText xml:space="preserve"> PAGEREF _Toc241160901 \h </w:instrText>
+        <w:instrText xml:space="preserve"> PAGEREF _Toc241436695 \h </w:instrText>
       </w:r>
       <w:r>
         <w:rPr>
@@ -452,7 +452,7 @@
         <w:rPr>
           <w:noProof/>
         </w:rPr>
-        <w:instrText xml:space="preserve"> PAGEREF _Toc241160902 \h </w:instrText>
+        <w:instrText xml:space="preserve"> PAGEREF _Toc241436696 \h </w:instrText>
       </w:r>
       <w:r>
         <w:rPr>
@@ -514,7 +514,7 @@
         <w:rPr>
           <w:noProof/>
         </w:rPr>
-        <w:instrText xml:space="preserve"> PAGEREF _Toc241160903 \h </w:instrText>
+        <w:instrText xml:space="preserve"> PAGEREF _Toc241436697 \h </w:instrText>
       </w:r>
       <w:r>
         <w:rPr>
@@ -576,7 +576,7 @@
         <w:rPr>
           <w:noProof/>
         </w:rPr>
-        <w:instrText xml:space="preserve"> PAGEREF _Toc241160904 \h </w:instrText>
+        <w:instrText xml:space="preserve"> PAGEREF _Toc241436698 \h </w:instrText>
       </w:r>
       <w:r>
         <w:rPr>
@@ -638,7 +638,7 @@
         <w:rPr>
           <w:noProof/>
         </w:rPr>
-        <w:instrText xml:space="preserve"> PAGEREF _Toc241160905 \h </w:instrText>
+        <w:instrText xml:space="preserve"> PAGEREF _Toc241436699 \h </w:instrText>
       </w:r>
       <w:r>
         <w:rPr>
@@ -700,7 +700,7 @@
         <w:rPr>
           <w:noProof/>
         </w:rPr>
-        <w:instrText xml:space="preserve"> PAGEREF _Toc241160906 \h </w:instrText>
+        <w:instrText xml:space="preserve"> PAGEREF _Toc241436700 \h </w:instrText>
       </w:r>
       <w:r>
         <w:rPr>
@@ -762,7 +762,7 @@
         <w:rPr>
           <w:noProof/>
         </w:rPr>
-        <w:instrText xml:space="preserve"> PAGEREF _Toc241160907 \h </w:instrText>
+        <w:instrText xml:space="preserve"> PAGEREF _Toc241436701 \h </w:instrText>
       </w:r>
       <w:r>
         <w:rPr>
@@ -824,7 +824,7 @@
         <w:rPr>
           <w:noProof/>
         </w:rPr>
-        <w:instrText xml:space="preserve"> PAGEREF _Toc241160908 \h </w:instrText>
+        <w:instrText xml:space="preserve"> PAGEREF _Toc241436702 \h </w:instrText>
       </w:r>
       <w:r>
         <w:rPr>
@@ -886,7 +886,7 @@
         <w:rPr>
           <w:noProof/>
         </w:rPr>
-        <w:instrText xml:space="preserve"> PAGEREF _Toc241160909 \h </w:instrText>
+        <w:instrText xml:space="preserve"> PAGEREF _Toc241436703 \h </w:instrText>
       </w:r>
       <w:r>
         <w:rPr>
@@ -948,7 +948,7 @@
         <w:rPr>
           <w:noProof/>
         </w:rPr>
-        <w:instrText xml:space="preserve"> PAGEREF _Toc241160910 \h </w:instrText>
+        <w:instrText xml:space="preserve"> PAGEREF _Toc241436704 \h </w:instrText>
       </w:r>
       <w:r>
         <w:rPr>
@@ -1010,7 +1010,7 @@
         <w:rPr>
           <w:noProof/>
         </w:rPr>
-        <w:instrText xml:space="preserve"> PAGEREF _Toc241160911 \h </w:instrText>
+        <w:instrText xml:space="preserve"> PAGEREF _Toc241436705 \h </w:instrText>
       </w:r>
       <w:r>
         <w:rPr>
@@ -1072,7 +1072,7 @@
         <w:rPr>
           <w:noProof/>
         </w:rPr>
-        <w:instrText xml:space="preserve"> PAGEREF _Toc241160912 \h </w:instrText>
+        <w:instrText xml:space="preserve"> PAGEREF _Toc241436706 \h </w:instrText>
       </w:r>
       <w:r>
         <w:rPr>
@@ -1134,7 +1134,7 @@
         <w:rPr>
           <w:noProof/>
         </w:rPr>
-        <w:instrText xml:space="preserve"> PAGEREF _Toc241160913 \h </w:instrText>
+        <w:instrText xml:space="preserve"> PAGEREF _Toc241436707 \h </w:instrText>
       </w:r>
       <w:r>
         <w:rPr>
@@ -1196,7 +1196,7 @@
         <w:rPr>
           <w:noProof/>
         </w:rPr>
-        <w:instrText xml:space="preserve"> PAGEREF _Toc241160914 \h </w:instrText>
+        <w:instrText xml:space="preserve"> PAGEREF _Toc241436708 \h </w:instrText>
       </w:r>
       <w:r>
         <w:rPr>
@@ -1258,7 +1258,7 @@
         <w:rPr>
           <w:noProof/>
         </w:rPr>
-        <w:instrText xml:space="preserve"> PAGEREF _Toc241160915 \h </w:instrText>
+        <w:instrText xml:space="preserve"> PAGEREF _Toc241436709 \h </w:instrText>
       </w:r>
       <w:r>
         <w:rPr>
@@ -1320,7 +1320,7 @@
         <w:rPr>
           <w:noProof/>
         </w:rPr>
-        <w:instrText xml:space="preserve"> PAGEREF _Toc241160916 \h </w:instrText>
+        <w:instrText xml:space="preserve"> PAGEREF _Toc241436710 \h </w:instrText>
       </w:r>
       <w:r>
         <w:rPr>
@@ -1382,7 +1382,7 @@
         <w:rPr>
           <w:noProof/>
         </w:rPr>
-        <w:instrText xml:space="preserve"> PAGEREF _Toc241160917 \h </w:instrText>
+        <w:instrText xml:space="preserve"> PAGEREF _Toc241436711 \h </w:instrText>
       </w:r>
       <w:r>
         <w:rPr>
@@ -1444,7 +1444,7 @@
         <w:rPr>
           <w:noProof/>
         </w:rPr>
-        <w:instrText xml:space="preserve"> PAGEREF _Toc241160918 \h </w:instrText>
+        <w:instrText xml:space="preserve"> PAGEREF _Toc241436712 \h </w:instrText>
       </w:r>
       <w:r>
         <w:rPr>
@@ -1506,7 +1506,7 @@
         <w:rPr>
           <w:noProof/>
         </w:rPr>
-        <w:instrText xml:space="preserve"> PAGEREF _Toc241160919 \h </w:instrText>
+        <w:instrText xml:space="preserve"> PAGEREF _Toc241436713 \h </w:instrText>
       </w:r>
       <w:r>
         <w:rPr>
@@ -1568,7 +1568,7 @@
         <w:rPr>
           <w:noProof/>
         </w:rPr>
-        <w:instrText xml:space="preserve"> PAGEREF _Toc241160920 \h </w:instrText>
+        <w:instrText xml:space="preserve"> PAGEREF _Toc241436714 \h </w:instrText>
       </w:r>
       <w:r>
         <w:rPr>
@@ -1630,7 +1630,7 @@
         <w:rPr>
           <w:noProof/>
         </w:rPr>
-        <w:instrText xml:space="preserve"> PAGEREF _Toc241160921 \h </w:instrText>
+        <w:instrText xml:space="preserve"> PAGEREF _Toc241436715 \h </w:instrText>
       </w:r>
       <w:r>
         <w:rPr>
@@ -1692,7 +1692,7 @@
         <w:rPr>
           <w:noProof/>
         </w:rPr>
-        <w:instrText xml:space="preserve"> PAGEREF _Toc241160922 \h </w:instrText>
+        <w:instrText xml:space="preserve"> PAGEREF _Toc241436716 \h </w:instrText>
       </w:r>
       <w:r>
         <w:rPr>
@@ -1754,7 +1754,7 @@
         <w:rPr>
           <w:noProof/>
         </w:rPr>
-        <w:instrText xml:space="preserve"> PAGEREF _Toc241160923 \h </w:instrText>
+        <w:instrText xml:space="preserve"> PAGEREF _Toc241436717 \h </w:instrText>
       </w:r>
       <w:r>
         <w:rPr>
@@ -1816,7 +1816,7 @@
         <w:rPr>
           <w:noProof/>
         </w:rPr>
-        <w:instrText xml:space="preserve"> PAGEREF _Toc241160924 \h </w:instrText>
+        <w:instrText xml:space="preserve"> PAGEREF _Toc241436718 \h </w:instrText>
       </w:r>
       <w:r>
         <w:rPr>
@@ -1878,7 +1878,7 @@
         <w:rPr>
           <w:noProof/>
         </w:rPr>
-        <w:instrText xml:space="preserve"> PAGEREF _Toc241160925 \h </w:instrText>
+        <w:instrText xml:space="preserve"> PAGEREF _Toc241436719 \h </w:instrText>
       </w:r>
       <w:r>
         <w:rPr>
@@ -1940,7 +1940,7 @@
         <w:rPr>
           <w:noProof/>
         </w:rPr>
-        <w:instrText xml:space="preserve"> PAGEREF _Toc241160926 \h </w:instrText>
+        <w:instrText xml:space="preserve"> PAGEREF _Toc241436720 \h </w:instrText>
       </w:r>
       <w:r>
         <w:rPr>
@@ -2002,7 +2002,7 @@
         <w:rPr>
           <w:noProof/>
         </w:rPr>
-        <w:instrText xml:space="preserve"> PAGEREF _Toc241160927 \h </w:instrText>
+        <w:instrText xml:space="preserve"> PAGEREF _Toc241436721 \h </w:instrText>
       </w:r>
       <w:r>
         <w:rPr>
@@ -2064,7 +2064,7 @@
         <w:rPr>
           <w:noProof/>
         </w:rPr>
-        <w:instrText xml:space="preserve"> PAGEREF _Toc241160928 \h </w:instrText>
+        <w:instrText xml:space="preserve"> PAGEREF _Toc241436722 \h </w:instrText>
       </w:r>
       <w:r>
         <w:rPr>
@@ -2126,7 +2126,7 @@
         <w:rPr>
           <w:noProof/>
         </w:rPr>
-        <w:instrText xml:space="preserve"> PAGEREF _Toc241160929 \h </w:instrText>
+        <w:instrText xml:space="preserve"> PAGEREF _Toc241436723 \h </w:instrText>
       </w:r>
       <w:r>
         <w:rPr>
@@ -2188,7 +2188,7 @@
         <w:rPr>
           <w:noProof/>
         </w:rPr>
-        <w:instrText xml:space="preserve"> PAGEREF _Toc241160930 \h </w:instrText>
+        <w:instrText xml:space="preserve"> PAGEREF _Toc241436724 \h </w:instrText>
       </w:r>
       <w:r>
         <w:rPr>
@@ -2250,7 +2250,7 @@
         <w:rPr>
           <w:noProof/>
         </w:rPr>
-        <w:instrText xml:space="preserve"> PAGEREF _Toc241160931 \h </w:instrText>
+        <w:instrText xml:space="preserve"> PAGEREF _Toc241436725 \h </w:instrText>
       </w:r>
       <w:r>
         <w:rPr>
@@ -2312,7 +2312,7 @@
         <w:rPr>
           <w:noProof/>
         </w:rPr>
-        <w:instrText xml:space="preserve"> PAGEREF _Toc241160932 \h </w:instrText>
+        <w:instrText xml:space="preserve"> PAGEREF _Toc241436726 \h </w:instrText>
       </w:r>
       <w:r>
         <w:rPr>
@@ -2363,7 +2363,7 @@
         </w:rPr>
         <w:fldChar w:fldCharType="end"/>
       </w:r>
-      <w:bookmarkStart w:id="1" w:name="_Toc241160897"/>
+      <w:bookmarkStart w:id="1" w:name="_Toc241436691"/>
     </w:p>
     <w:bookmarkEnd w:id="1"/>
     <w:p>
@@ -2712,7 +2712,7 @@
           <w:rFonts w:eastAsia="Times New Roman"/>
         </w:rPr>
       </w:pPr>
-      <w:bookmarkStart w:id="2" w:name="_Toc241160898"/>
+      <w:bookmarkStart w:id="2" w:name="_Toc241436692"/>
       <w:r>
         <w:rPr>
           <w:rFonts w:eastAsia="Times New Roman"/>
@@ -3047,7 +3047,7 @@
           <w:rFonts w:eastAsia="Times New Roman"/>
         </w:rPr>
       </w:pPr>
-      <w:bookmarkStart w:id="3" w:name="_Toc241160899"/>
+      <w:bookmarkStart w:id="3" w:name="_Toc241436693"/>
       <w:r>
         <w:rPr>
           <w:rFonts w:eastAsia="Times New Roman"/>
@@ -3222,7 +3222,7 @@
           <w:rFonts w:eastAsia="Times New Roman"/>
         </w:rPr>
       </w:pPr>
-      <w:bookmarkStart w:id="4" w:name="_Toc241160900"/>
+      <w:bookmarkStart w:id="4" w:name="_Toc241436694"/>
       <w:r>
         <w:rPr>
           <w:rFonts w:eastAsia="Times New Roman"/>
@@ -3785,7 +3785,7 @@
           <w:rFonts w:eastAsia="Times New Roman"/>
         </w:rPr>
       </w:pPr>
-      <w:bookmarkStart w:id="5" w:name="_Toc241160901"/>
+      <w:bookmarkStart w:id="5" w:name="_Toc241436695"/>
       <w:r>
         <w:rPr>
           <w:rFonts w:eastAsia="Times New Roman"/>
@@ -3821,7 +3821,7 @@
           <w:rFonts w:eastAsia="Times New Roman"/>
         </w:rPr>
       </w:pPr>
-      <w:bookmarkStart w:id="6" w:name="_Toc241160902"/>
+      <w:bookmarkStart w:id="6" w:name="_Toc241436696"/>
       <w:r>
         <w:rPr>
           <w:rFonts w:eastAsia="Times New Roman"/>
@@ -4376,7 +4376,7 @@
           <w:rFonts w:eastAsia="Times New Roman"/>
         </w:rPr>
       </w:pPr>
-      <w:bookmarkStart w:id="7" w:name="_Toc241160903"/>
+      <w:bookmarkStart w:id="7" w:name="_Toc241436697"/>
       <w:r>
         <w:rPr>
           <w:rFonts w:eastAsia="Times New Roman"/>
@@ -4788,7 +4788,7 @@
           <w:rFonts w:eastAsia="Times New Roman"/>
         </w:rPr>
       </w:pPr>
-      <w:bookmarkStart w:id="8" w:name="_Toc241160904"/>
+      <w:bookmarkStart w:id="8" w:name="_Toc241436698"/>
       <w:r>
         <w:rPr>
           <w:rFonts w:eastAsia="Times New Roman"/>
@@ -5054,7 +5054,7 @@
           <w:rFonts w:eastAsia="Times New Roman"/>
         </w:rPr>
       </w:pPr>
-      <w:bookmarkStart w:id="9" w:name="_Toc241160905"/>
+      <w:bookmarkStart w:id="9" w:name="_Toc241436699"/>
       <w:r>
         <w:rPr>
           <w:rFonts w:eastAsia="Times New Roman"/>
@@ -5683,7 +5683,7 @@
           <w:rFonts w:eastAsia="Times New Roman"/>
         </w:rPr>
       </w:pPr>
-      <w:bookmarkStart w:id="10" w:name="_Toc241160906"/>
+      <w:bookmarkStart w:id="10" w:name="_Toc241436700"/>
       <w:r>
         <w:rPr>
           <w:rFonts w:eastAsia="Times New Roman"/>
@@ -6118,7 +6118,7 @@
           <w:rFonts w:eastAsia="Times New Roman"/>
         </w:rPr>
       </w:pPr>
-      <w:bookmarkStart w:id="11" w:name="_Toc241160907"/>
+      <w:bookmarkStart w:id="11" w:name="_Toc241436701"/>
       <w:r>
         <w:rPr>
           <w:rFonts w:eastAsia="Times New Roman"/>
@@ -6365,7 +6365,7 @@
           <w:rFonts w:eastAsia="Times New Roman"/>
         </w:rPr>
       </w:pPr>
-      <w:bookmarkStart w:id="12" w:name="_Toc241160908"/>
+      <w:bookmarkStart w:id="12" w:name="_Toc241436702"/>
       <w:r>
         <w:rPr>
           <w:rFonts w:eastAsia="Times New Roman"/>
@@ -6515,7 +6515,7 @@
           <w:rFonts w:eastAsia="Times New Roman"/>
         </w:rPr>
       </w:pPr>
-      <w:bookmarkStart w:id="13" w:name="_Toc241160909"/>
+      <w:bookmarkStart w:id="13" w:name="_Toc241436703"/>
       <w:r>
         <w:rPr>
           <w:rFonts w:eastAsia="Times New Roman"/>
@@ -6837,7 +6837,7 @@
           <w:rFonts w:eastAsia="Times New Roman"/>
         </w:rPr>
       </w:pPr>
-      <w:bookmarkStart w:id="14" w:name="_Toc241160910"/>
+      <w:bookmarkStart w:id="14" w:name="_Toc241436704"/>
       <w:r>
         <w:rPr>
           <w:rFonts w:eastAsia="Times New Roman"/>
@@ -7031,7 +7031,7 @@
           <w:rFonts w:eastAsia="Times New Roman"/>
         </w:rPr>
       </w:pPr>
-      <w:bookmarkStart w:id="15" w:name="_Toc241160911"/>
+      <w:bookmarkStart w:id="15" w:name="_Toc241436705"/>
       <w:r>
         <w:rPr>
           <w:rFonts w:eastAsia="Times New Roman"/>
@@ -7406,7 +7406,7 @@
           <w:rFonts w:eastAsia="Times New Roman"/>
         </w:rPr>
       </w:pPr>
-      <w:bookmarkStart w:id="16" w:name="_Toc241160912"/>
+      <w:bookmarkStart w:id="16" w:name="_Toc241436706"/>
       <w:r>
         <w:rPr>
           <w:rFonts w:eastAsia="Times New Roman"/>
@@ -8180,7 +8180,7 @@
           <w:rFonts w:eastAsia="Times New Roman"/>
         </w:rPr>
       </w:pPr>
-      <w:bookmarkStart w:id="17" w:name="_Toc241160913"/>
+      <w:bookmarkStart w:id="17" w:name="_Toc241436707"/>
       <w:r>
         <w:rPr>
           <w:rFonts w:eastAsia="Times New Roman"/>
@@ -8379,7 +8379,7 @@
           <w:rFonts w:eastAsia="Times New Roman"/>
         </w:rPr>
       </w:pPr>
-      <w:bookmarkStart w:id="18" w:name="_Toc241160914"/>
+      <w:bookmarkStart w:id="18" w:name="_Toc241436708"/>
       <w:r>
         <w:rPr>
           <w:rFonts w:eastAsia="Times New Roman"/>
@@ -8409,7 +8409,7 @@
           <w:rFonts w:eastAsia="Times New Roman"/>
         </w:rPr>
       </w:pPr>
-      <w:bookmarkStart w:id="19" w:name="_Toc241160915"/>
+      <w:bookmarkStart w:id="19" w:name="_Toc241436709"/>
       <w:r>
         <w:rPr>
           <w:rFonts w:eastAsia="Times New Roman"/>
@@ -8653,7 +8653,7 @@
           <w:rFonts w:eastAsia="Times New Roman"/>
         </w:rPr>
       </w:pPr>
-      <w:bookmarkStart w:id="20" w:name="_Toc241160916"/>
+      <w:bookmarkStart w:id="20" w:name="_Toc241436710"/>
       <w:r>
         <w:rPr>
           <w:rFonts w:eastAsia="Times New Roman"/>
@@ -9195,7 +9195,7 @@
           <w:rFonts w:eastAsia="Times New Roman"/>
         </w:rPr>
       </w:pPr>
-      <w:bookmarkStart w:id="21" w:name="_Toc241160917"/>
+      <w:bookmarkStart w:id="21" w:name="_Toc241436711"/>
       <w:r>
         <w:rPr>
           <w:rFonts w:eastAsia="Times New Roman"/>
@@ -9854,7 +9854,7 @@
           <w:rFonts w:eastAsia="Times New Roman"/>
         </w:rPr>
       </w:pPr>
-      <w:bookmarkStart w:id="22" w:name="_Toc241160918"/>
+      <w:bookmarkStart w:id="22" w:name="_Toc241436712"/>
       <w:r>
         <w:rPr>
           <w:rFonts w:eastAsia="Times New Roman"/>
@@ -10373,7 +10373,7 @@
           <w:rFonts w:eastAsia="Times New Roman"/>
         </w:rPr>
       </w:pPr>
-      <w:bookmarkStart w:id="23" w:name="_Toc241160919"/>
+      <w:bookmarkStart w:id="23" w:name="_Toc241436713"/>
       <w:r>
         <w:rPr>
           <w:rFonts w:eastAsia="Times New Roman"/>
@@ -10403,7 +10403,7 @@
           <w:rFonts w:eastAsia="Times New Roman"/>
         </w:rPr>
       </w:pPr>
-      <w:bookmarkStart w:id="24" w:name="_Toc241160920"/>
+      <w:bookmarkStart w:id="24" w:name="_Toc241436714"/>
       <w:r>
         <w:rPr>
           <w:rFonts w:eastAsia="Times New Roman"/>
@@ -11118,7 +11118,7 @@
                 <w:sz w:val="19"/>
                 <w:szCs w:val="19"/>
               </w:rPr>
-              <w:t>34</w:t>
+              <w:t>35</w:t>
             </w:r>
           </w:p>
         </w:tc>
@@ -11544,7 +11544,7 @@
           <w:rFonts w:eastAsia="Times New Roman"/>
         </w:rPr>
       </w:pPr>
-      <w:bookmarkStart w:id="25" w:name="_Toc241160921"/>
+      <w:bookmarkStart w:id="25" w:name="_Toc241436715"/>
       <w:r>
         <w:rPr>
           <w:rFonts w:eastAsia="Times New Roman"/>
@@ -11570,7 +11570,7 @@
           <w:sz w:val="21"/>
           <w:szCs w:val="21"/>
         </w:rPr>
-        <w:t xml:space="preserve">151 jurisdictions are covered, together with 26 named sub-registers listed at the end. The </w:t>
+        <w:t xml:space="preserve">152 jurisdictions are covered, together with 26 named sub-registers listed at the end. The </w:t>
       </w:r>
       <w:r>
         <w:rPr>
@@ -11610,27 +11610,27 @@
           <w:sz w:val="21"/>
           <w:szCs w:val="21"/>
         </w:rPr>
-        <w:t>entries are STP's fifteen priority jurisdictions; the letter is the price tier per section 2.1, and — marks a jurisdiction that is not on a tier. Where a jurisdiction has no single national register, it is covered only through the sub-registers named below. Austria and Germany are not covered by this Agreement.</w:t>
-      </w:r>
-    </w:p>
-    <w:p>
-      <w:pPr>
-        <w:divId w:val="1133988642"/>
-        <w:rPr>
-          <w:rFonts w:ascii="Calibri" w:eastAsia="Times New Roman" w:hAnsi="Calibri" w:cs="Calibri"/>
-          <w:color w:val="222233"/>
-          <w:sz w:val="21"/>
-          <w:szCs w:val="21"/>
-        </w:rPr>
-      </w:pPr>
-      <w:r>
-        <w:rPr>
-          <w:rFonts w:ascii="Calibri" w:eastAsia="Times New Roman" w:hAnsi="Calibri" w:cs="Calibri"/>
-          <w:color w:val="222233"/>
-          <w:sz w:val="21"/>
-          <w:szCs w:val="21"/>
-        </w:rPr>
-        <w:t>Europe 47</w:t>
+        <w:t>entries are STP's fifteen priority jurisdictions; the letter is the price tier per section 2.1, and — marks a jurisdiction that is not on a tier. Where a jurisdiction has no single national register, it is covered only through the sub-registers named below. Germany is not covered by this Agreement.</w:t>
+      </w:r>
+    </w:p>
+    <w:p>
+      <w:pPr>
+        <w:divId w:val="856502831"/>
+        <w:rPr>
+          <w:rFonts w:ascii="Calibri" w:eastAsia="Times New Roman" w:hAnsi="Calibri" w:cs="Calibri"/>
+          <w:color w:val="222233"/>
+          <w:sz w:val="21"/>
+          <w:szCs w:val="21"/>
+        </w:rPr>
+      </w:pPr>
+      <w:r>
+        <w:rPr>
+          <w:rFonts w:ascii="Calibri" w:eastAsia="Times New Roman" w:hAnsi="Calibri" w:cs="Calibri"/>
+          <w:color w:val="222233"/>
+          <w:sz w:val="21"/>
+          <w:szCs w:val="21"/>
+        </w:rPr>
+        <w:t>Europe 48</w:t>
       </w:r>
     </w:p>
     <w:p>
@@ -11650,21 +11650,21 @@
           <w:sz w:val="21"/>
           <w:szCs w:val="21"/>
         </w:rPr>
-        <w:t>Aaland Islands B, Albania A, Belarus A, Belgium A, Bosnia and Herzegovina A, Bulgaria A, Croatia A, Cyprus B, Czech Republic A, Denmark A, Estonia A, Faroe Islands A, Finland B, France C, Gibraltar B, Greece A, Guernsey C, Hungary A, Iceland A, Ireland A, Isle of Man B, Italy B, Jersey A, Kosovo A, Latvia A, Liechtenstein B, Luxembourg B, Malta B, Moldova A, Monaco C, Montenegro A, Netherlands A, North Macedonia B, Norway A, Poland A, Portugal C, Romania B, Russia A, San Marino B, Serbia A, Slovakia A, Slov</w:t>
-      </w:r>
-      <w:r>
-        <w:rPr>
-          <w:rFonts w:ascii="Calibri" w:hAnsi="Calibri" w:cs="Calibri"/>
-          <w:color w:val="222233"/>
-          <w:sz w:val="21"/>
-          <w:szCs w:val="21"/>
-        </w:rPr>
-        <w:t>enia A, Spain B, Sweden C, Switzerland A, Ukraine A, United Kingdom A</w:t>
-      </w:r>
-    </w:p>
-    <w:p>
-      <w:pPr>
-        <w:divId w:val="59402598"/>
+        <w:t>Aaland Islands B, Albania A, Austria B, Belarus A, Belgium A, Bosnia and Herzegovina A, Bulgaria A, Croatia A, Cyprus B, Czech Republic A, Denmark A, Estonia A, Faroe Islands A, Finland B, France C, Gibraltar B, Greece A, Guernsey C, Hungary A, Iceland A, Ireland A, Isle of Man B, Italy B, Jersey A, Kosovo A, Latvia A, Liechtenstein B, Luxembourg B, Malta B, Moldova A, Monaco C, Montenegro A, Netherlands A, North Macedonia B, Norway A, Poland A, Portugal C, Romania B, Russia A, San Marino B, Serbia A, Slova</w:t>
+      </w:r>
+      <w:r>
+        <w:rPr>
+          <w:rFonts w:ascii="Calibri" w:hAnsi="Calibri" w:cs="Calibri"/>
+          <w:color w:val="222233"/>
+          <w:sz w:val="21"/>
+          <w:szCs w:val="21"/>
+        </w:rPr>
+        <w:t>kia A, Slovenia A, Spain B, Sweden C, Switzerland A, Ukraine A, United Kingdom A</w:t>
+      </w:r>
+    </w:p>
+    <w:p>
+      <w:pPr>
+        <w:divId w:val="1029182272"/>
         <w:rPr>
           <w:rFonts w:ascii="Calibri" w:eastAsia="Times New Roman" w:hAnsi="Calibri" w:cs="Calibri"/>
           <w:color w:val="222233"/>
@@ -11704,7 +11704,7 @@
     </w:p>
     <w:p>
       <w:pPr>
-        <w:divId w:val="639770735"/>
+        <w:divId w:val="2117095635"/>
         <w:rPr>
           <w:rFonts w:ascii="Calibri" w:eastAsia="Times New Roman" w:hAnsi="Calibri" w:cs="Calibri"/>
           <w:color w:val="222233"/>
@@ -11744,7 +11744,7 @@
     </w:p>
     <w:p>
       <w:pPr>
-        <w:divId w:val="1306275250"/>
+        <w:divId w:val="1359962946"/>
         <w:rPr>
           <w:rFonts w:ascii="Calibri" w:eastAsia="Times New Roman" w:hAnsi="Calibri" w:cs="Calibri"/>
           <w:color w:val="222233"/>
@@ -11784,7 +11784,7 @@
     </w:p>
     <w:p>
       <w:pPr>
-        <w:divId w:val="387345994"/>
+        <w:divId w:val="35280923"/>
         <w:rPr>
           <w:rFonts w:ascii="Calibri" w:eastAsia="Times New Roman" w:hAnsi="Calibri" w:cs="Calibri"/>
           <w:color w:val="222233"/>
@@ -11824,7 +11824,7 @@
     </w:p>
     <w:p>
       <w:pPr>
-        <w:divId w:val="638190710"/>
+        <w:divId w:val="504325649"/>
         <w:rPr>
           <w:rFonts w:ascii="Calibri" w:eastAsia="Times New Roman" w:hAnsi="Calibri" w:cs="Calibri"/>
           <w:color w:val="222233"/>
@@ -11864,7 +11864,7 @@
     </w:p>
     <w:p>
       <w:pPr>
-        <w:divId w:val="1020204757"/>
+        <w:divId w:val="1112821039"/>
         <w:rPr>
           <w:rFonts w:ascii="Calibri" w:eastAsia="Times New Roman" w:hAnsi="Calibri" w:cs="Calibri"/>
           <w:color w:val="222233"/>
@@ -12024,7 +12024,7 @@
           <w:rFonts w:eastAsia="Times New Roman"/>
         </w:rPr>
       </w:pPr>
-      <w:bookmarkStart w:id="26" w:name="_Toc241160922"/>
+      <w:bookmarkStart w:id="26" w:name="_Toc241436716"/>
       <w:r>
         <w:rPr>
           <w:rFonts w:eastAsia="Times New Roman"/>
@@ -12040,7 +12040,7 @@
           <w:rFonts w:eastAsia="Times New Roman"/>
         </w:rPr>
       </w:pPr>
-      <w:bookmarkStart w:id="27" w:name="_Toc241160923"/>
+      <w:bookmarkStart w:id="27" w:name="_Toc241436717"/>
       <w:r>
         <w:rPr>
           <w:rFonts w:eastAsia="Times New Roman"/>
@@ -12255,7 +12255,7 @@
           <w:rFonts w:eastAsia="Times New Roman"/>
         </w:rPr>
       </w:pPr>
-      <w:bookmarkStart w:id="28" w:name="_Toc241160924"/>
+      <w:bookmarkStart w:id="28" w:name="_Toc241436718"/>
       <w:r>
         <w:rPr>
           <w:rFonts w:eastAsia="Times New Roman"/>
@@ -12291,7 +12291,7 @@
           <w:rFonts w:eastAsia="Times New Roman"/>
         </w:rPr>
       </w:pPr>
-      <w:bookmarkStart w:id="29" w:name="_Toc241160925"/>
+      <w:bookmarkStart w:id="29" w:name="_Toc241436719"/>
       <w:r>
         <w:rPr>
           <w:rFonts w:eastAsia="Times New Roman"/>
@@ -12317,16 +12317,16 @@
           <w:sz w:val="21"/>
           <w:szCs w:val="21"/>
         </w:rPr>
-        <w:t>W</w:t>
-      </w:r>
-      <w:r>
-        <w:rPr>
-          <w:rFonts w:ascii="Calibri" w:hAnsi="Calibri" w:cs="Calibri"/>
-          <w:color w:val="222233"/>
-          <w:sz w:val="21"/>
-          <w:szCs w:val="21"/>
-        </w:rPr>
-        <w:t>hat an End Client may do with a Document is set out in clause 3.5. STP determines its terms with End Clients itself.</w:t>
+        <w:t>Wha</w:t>
+      </w:r>
+      <w:r>
+        <w:rPr>
+          <w:rFonts w:ascii="Calibri" w:hAnsi="Calibri" w:cs="Calibri"/>
+          <w:color w:val="222233"/>
+          <w:sz w:val="21"/>
+          <w:szCs w:val="21"/>
+        </w:rPr>
+        <w:t>t an End Client may do with a Document is set out in clause 3.5. STP determines its terms with End Clients itself.</w:t>
       </w:r>
     </w:p>
     <w:p>
@@ -12371,7 +12371,7 @@
           <w:rFonts w:eastAsia="Times New Roman"/>
         </w:rPr>
       </w:pPr>
-      <w:bookmarkStart w:id="30" w:name="_Toc241160926"/>
+      <w:bookmarkStart w:id="30" w:name="_Toc241436720"/>
       <w:r>
         <w:rPr>
           <w:rFonts w:eastAsia="Times New Roman"/>
@@ -12401,7 +12401,7 @@
           <w:rFonts w:eastAsia="Times New Roman"/>
         </w:rPr>
       </w:pPr>
-      <w:bookmarkStart w:id="31" w:name="_Toc241160927"/>
+      <w:bookmarkStart w:id="31" w:name="_Toc241436721"/>
       <w:r>
         <w:rPr>
           <w:rFonts w:eastAsia="Times New Roman"/>
@@ -12533,7 +12533,7 @@
           <w:rFonts w:eastAsia="Times New Roman"/>
         </w:rPr>
       </w:pPr>
-      <w:bookmarkStart w:id="32" w:name="_Toc241160928"/>
+      <w:bookmarkStart w:id="32" w:name="_Toc241436722"/>
       <w:r>
         <w:rPr>
           <w:rFonts w:eastAsia="Times New Roman"/>
@@ -12954,7 +12954,7 @@
           <w:rFonts w:eastAsia="Times New Roman"/>
         </w:rPr>
       </w:pPr>
-      <w:bookmarkStart w:id="33" w:name="_Toc241160929"/>
+      <w:bookmarkStart w:id="33" w:name="_Toc241436723"/>
       <w:r>
         <w:rPr>
           <w:rFonts w:eastAsia="Times New Roman"/>
@@ -13010,7 +13010,7 @@
           <w:rFonts w:eastAsia="Times New Roman"/>
         </w:rPr>
       </w:pPr>
-      <w:bookmarkStart w:id="34" w:name="_Toc241160930"/>
+      <w:bookmarkStart w:id="34" w:name="_Toc241436724"/>
       <w:r>
         <w:rPr>
           <w:rFonts w:eastAsia="Times New Roman"/>
@@ -13170,7 +13170,7 @@
           <w:rFonts w:eastAsia="Times New Roman"/>
         </w:rPr>
       </w:pPr>
-      <w:bookmarkStart w:id="35" w:name="_Toc241160931"/>
+      <w:bookmarkStart w:id="35" w:name="_Toc241436725"/>
       <w:r>
         <w:rPr>
           <w:rFonts w:eastAsia="Times New Roman"/>
@@ -13372,7 +13372,7 @@
           <w:rFonts w:eastAsia="Times New Roman"/>
         </w:rPr>
       </w:pPr>
-      <w:bookmarkStart w:id="36" w:name="_Toc241160932"/>
+      <w:bookmarkStart w:id="36" w:name="_Toc241436726"/>
       <w:r>
         <w:rPr>
           <w:rFonts w:eastAsia="Times New Roman"/>
@@ -13414,9 +13414,9 @@
 <file path=word/numbering.xml><?xml version="1.0" encoding="utf-8"?>
 <w:numbering xmlns:wpc="http://schemas.microsoft.com/office/word/2010/wordprocessingCanvas" xmlns:cx="http://schemas.microsoft.com/office/drawing/2014/chartex" xmlns:cx1="http://schemas.microsoft.com/office/drawing/2015/9/8/chartex" xmlns:cx2="http://schemas.microsoft.com/office/drawing/2015/10/21/chartex" xmlns:cx3="http://schemas.microsoft.com/office/drawing/2016/5/9/chartex" xmlns:cx4="http://schemas.microsoft.com/office/drawing/2016/5/10/chartex" xmlns:cx5="http://schemas.microsoft.com/office/drawing/2016/5/11/chartex" xmlns:cx6="http://schemas.microsoft.com/office/drawing/2016/5/12/chartex" xmlns:cx7="http://schemas.microsoft.com/office/drawing/2016/5/13/chartex" xmlns:cx8="http://schemas.microsoft.com/office/drawing/2016/5/14/chartex" xmlns:mc="http://schemas.openxmlformats.org/markup-compatibility/2006" xmlns:aink="http://schemas.microsoft.com/office/drawing/2016/ink" xmlns:am3d="http://schemas.microsoft.com/office/drawing/2017/model3d" xmlns:o="urn:schemas-microsoft-com:office:office" xmlns:oel="http://schemas.microsoft.com/office/2019/extlst" xmlns:r="http://schemas.openxmlformats.org/officeDocument/2006/relationships" xmlns:m="http://schemas.openxmlformats.org/officeDocument/2006/math" xmlns:v="urn:schemas-microsoft-com:vml" xmlns:wp14="http://schemas.microsoft.com/office/word/2010/wordprocessingDrawing" xmlns:wp="http://schemas.openxmlformats.org/drawingml/2006/wordprocessingDrawing" xmlns:w10="urn:schemas-microsoft-com:office:word" xmlns:w="http://schemas.openxmlformats.org/wordprocessingml/2006/main" xmlns:w14="http://schemas.microsoft.com/office/word/2010/wordml" xmlns:w15="http://schemas.microsoft.com/office/word/2012/wordml" xmlns:w16cex="http://schemas.microsoft.com/office/word/2018/wordml/cex" xmlns:w16cid="http://schemas.microsoft.com/office/word/2016/wordml/cid" xmlns:w16="http://schemas.microsoft.com/office/word/2018/wordml" xmlns:w16du="http://schemas.microsoft.com/office/word/2023/wordml/word16du" xmlns:w16sdtdh="http://schemas.microsoft.com/office/word/2020/wordml/sdtdatahash" xmlns:w16sdtfl="http://schemas.microsoft.com/office/word/2024/wordml/sdtformatlock" xmlns:w16se="http://schemas.microsoft.com/office/word/2015/wordml/symex" xmlns:wpg="http://schemas.microsoft.com/office/word/2010/wordprocessingGroup" xmlns:wpi="http://schemas.microsoft.com/office/word/2010/wordprocessingInk" xmlns:wne="http://schemas.microsoft.com/office/word/2006/wordml" xmlns:wps="http://schemas.microsoft.com/office/word/2010/wordprocessingShape" mc:Ignorable="w14 w15 w16se w16cid w16 w16cex w16sdtdh w16sdtfl w16du wp14">
   <w:abstractNum w:abstractNumId="0" w15:restartNumberingAfterBreak="0">
-    <w:nsid w:val="1AA31ECC"/>
+    <w:nsid w:val="0B055FE2"/>
     <w:multiLevelType w:val="multilevel"/>
-    <w:tmpl w:val="01A6974C"/>
+    <w:tmpl w:val="3900249C"/>
     <w:lvl w:ilvl="0">
       <w:start w:val="1"/>
       <w:numFmt w:val="bullet"/>
@@ -13563,9 +13563,456 @@
     </w:lvl>
   </w:abstractNum>
   <w:abstractNum w:abstractNumId="1" w15:restartNumberingAfterBreak="0">
-    <w:nsid w:val="1C7B4DEF"/>
+    <w:nsid w:val="156916E5"/>
     <w:multiLevelType w:val="multilevel"/>
-    <w:tmpl w:val="1C321748"/>
+    <w:tmpl w:val="01F2FCD4"/>
+    <w:lvl w:ilvl="0">
+      <w:start w:val="1"/>
+      <w:numFmt w:val="bullet"/>
+      <w:lvlText w:val=""/>
+      <w:lvlJc w:val="left"/>
+      <w:pPr>
+        <w:tabs>
+          <w:tab w:val="num" w:pos="720"/>
+        </w:tabs>
+        <w:ind w:left="720" w:hanging="360"/>
+      </w:pPr>
+      <w:rPr>
+        <w:rFonts w:ascii="Symbol" w:hAnsi="Symbol" w:hint="default"/>
+        <w:sz w:val="20"/>
+      </w:rPr>
+    </w:lvl>
+    <w:lvl w:ilvl="1" w:tentative="1">
+      <w:start w:val="1"/>
+      <w:numFmt w:val="bullet"/>
+      <w:lvlText w:val="o"/>
+      <w:lvlJc w:val="left"/>
+      <w:pPr>
+        <w:tabs>
+          <w:tab w:val="num" w:pos="1440"/>
+        </w:tabs>
+        <w:ind w:left="1440" w:hanging="360"/>
+      </w:pPr>
+      <w:rPr>
+        <w:rFonts w:ascii="Courier New" w:hAnsi="Courier New" w:hint="default"/>
+        <w:sz w:val="20"/>
+      </w:rPr>
+    </w:lvl>
+    <w:lvl w:ilvl="2" w:tentative="1">
+      <w:start w:val="1"/>
+      <w:numFmt w:val="bullet"/>
+      <w:lvlText w:val=""/>
+      <w:lvlJc w:val="left"/>
+      <w:pPr>
+        <w:tabs>
+          <w:tab w:val="num" w:pos="2160"/>
+        </w:tabs>
+        <w:ind w:left="2160" w:hanging="360"/>
+      </w:pPr>
+      <w:rPr>
+        <w:rFonts w:ascii="Wingdings" w:hAnsi="Wingdings" w:hint="default"/>
+        <w:sz w:val="20"/>
+      </w:rPr>
+    </w:lvl>
+    <w:lvl w:ilvl="3" w:tentative="1">
+      <w:start w:val="1"/>
+      <w:numFmt w:val="bullet"/>
+      <w:lvlText w:val=""/>
+      <w:lvlJc w:val="left"/>
+      <w:pPr>
+        <w:tabs>
+          <w:tab w:val="num" w:pos="2880"/>
+        </w:tabs>
+        <w:ind w:left="2880" w:hanging="360"/>
+      </w:pPr>
+      <w:rPr>
+        <w:rFonts w:ascii="Wingdings" w:hAnsi="Wingdings" w:hint="default"/>
+        <w:sz w:val="20"/>
+      </w:rPr>
+    </w:lvl>
+    <w:lvl w:ilvl="4" w:tentative="1">
+      <w:start w:val="1"/>
+      <w:numFmt w:val="bullet"/>
+      <w:lvlText w:val=""/>
+      <w:lvlJc w:val="left"/>
+      <w:pPr>
+        <w:tabs>
+          <w:tab w:val="num" w:pos="3600"/>
+        </w:tabs>
+        <w:ind w:left="3600" w:hanging="360"/>
+      </w:pPr>
+      <w:rPr>
+        <w:rFonts w:ascii="Wingdings" w:hAnsi="Wingdings" w:hint="default"/>
+        <w:sz w:val="20"/>
+      </w:rPr>
+    </w:lvl>
+    <w:lvl w:ilvl="5" w:tentative="1">
+      <w:start w:val="1"/>
+      <w:numFmt w:val="bullet"/>
+      <w:lvlText w:val=""/>
+      <w:lvlJc w:val="left"/>
+      <w:pPr>
+        <w:tabs>
+          <w:tab w:val="num" w:pos="4320"/>
+        </w:tabs>
+        <w:ind w:left="4320" w:hanging="360"/>
+      </w:pPr>
+      <w:rPr>
+        <w:rFonts w:ascii="Wingdings" w:hAnsi="Wingdings" w:hint="default"/>
+        <w:sz w:val="20"/>
+      </w:rPr>
+    </w:lvl>
+    <w:lvl w:ilvl="6" w:tentative="1">
+      <w:start w:val="1"/>
+      <w:numFmt w:val="bullet"/>
+      <w:lvlText w:val=""/>
+      <w:lvlJc w:val="left"/>
+      <w:pPr>
+        <w:tabs>
+          <w:tab w:val="num" w:pos="5040"/>
+        </w:tabs>
+        <w:ind w:left="5040" w:hanging="360"/>
+      </w:pPr>
+      <w:rPr>
+        <w:rFonts w:ascii="Wingdings" w:hAnsi="Wingdings" w:hint="default"/>
+        <w:sz w:val="20"/>
+      </w:rPr>
+    </w:lvl>
+    <w:lvl w:ilvl="7" w:tentative="1">
+      <w:start w:val="1"/>
+      <w:numFmt w:val="bullet"/>
+      <w:lvlText w:val=""/>
+      <w:lvlJc w:val="left"/>
+      <w:pPr>
+        <w:tabs>
+          <w:tab w:val="num" w:pos="5760"/>
+        </w:tabs>
+        <w:ind w:left="5760" w:hanging="360"/>
+      </w:pPr>
+      <w:rPr>
+        <w:rFonts w:ascii="Wingdings" w:hAnsi="Wingdings" w:hint="default"/>
+        <w:sz w:val="20"/>
+      </w:rPr>
+    </w:lvl>
+    <w:lvl w:ilvl="8" w:tentative="1">
+      <w:start w:val="1"/>
+      <w:numFmt w:val="bullet"/>
+      <w:lvlText w:val=""/>
+      <w:lvlJc w:val="left"/>
+      <w:pPr>
+        <w:tabs>
+          <w:tab w:val="num" w:pos="6480"/>
+        </w:tabs>
+        <w:ind w:left="6480" w:hanging="360"/>
+      </w:pPr>
+      <w:rPr>
+        <w:rFonts w:ascii="Wingdings" w:hAnsi="Wingdings" w:hint="default"/>
+        <w:sz w:val="20"/>
+      </w:rPr>
+    </w:lvl>
+  </w:abstractNum>
+  <w:abstractNum w:abstractNumId="2" w15:restartNumberingAfterBreak="0">
+    <w:nsid w:val="31CE7AEC"/>
+    <w:multiLevelType w:val="multilevel"/>
+    <w:tmpl w:val="16FE8E9E"/>
+    <w:lvl w:ilvl="0">
+      <w:start w:val="1"/>
+      <w:numFmt w:val="bullet"/>
+      <w:lvlText w:val=""/>
+      <w:lvlJc w:val="left"/>
+      <w:pPr>
+        <w:tabs>
+          <w:tab w:val="num" w:pos="720"/>
+        </w:tabs>
+        <w:ind w:left="720" w:hanging="360"/>
+      </w:pPr>
+      <w:rPr>
+        <w:rFonts w:ascii="Symbol" w:hAnsi="Symbol" w:hint="default"/>
+        <w:sz w:val="20"/>
+      </w:rPr>
+    </w:lvl>
+    <w:lvl w:ilvl="1" w:tentative="1">
+      <w:start w:val="1"/>
+      <w:numFmt w:val="bullet"/>
+      <w:lvlText w:val="o"/>
+      <w:lvlJc w:val="left"/>
+      <w:pPr>
+        <w:tabs>
+          <w:tab w:val="num" w:pos="1440"/>
+        </w:tabs>
+        <w:ind w:left="1440" w:hanging="360"/>
+      </w:pPr>
+      <w:rPr>
+        <w:rFonts w:ascii="Courier New" w:hAnsi="Courier New" w:hint="default"/>
+        <w:sz w:val="20"/>
+      </w:rPr>
+    </w:lvl>
+    <w:lvl w:ilvl="2" w:tentative="1">
+      <w:start w:val="1"/>
+      <w:numFmt w:val="bullet"/>
+      <w:lvlText w:val=""/>
+      <w:lvlJc w:val="left"/>
+      <w:pPr>
+        <w:tabs>
+          <w:tab w:val="num" w:pos="2160"/>
+        </w:tabs>
+        <w:ind w:left="2160" w:hanging="360"/>
+      </w:pPr>
+      <w:rPr>
+        <w:rFonts w:ascii="Wingdings" w:hAnsi="Wingdings" w:hint="default"/>
+        <w:sz w:val="20"/>
+      </w:rPr>
+    </w:lvl>
+    <w:lvl w:ilvl="3" w:tentative="1">
+      <w:start w:val="1"/>
+      <w:numFmt w:val="bullet"/>
+      <w:lvlText w:val=""/>
+      <w:lvlJc w:val="left"/>
+      <w:pPr>
+        <w:tabs>
+          <w:tab w:val="num" w:pos="2880"/>
+        </w:tabs>
+        <w:ind w:left="2880" w:hanging="360"/>
+      </w:pPr>
+      <w:rPr>
+        <w:rFonts w:ascii="Wingdings" w:hAnsi="Wingdings" w:hint="default"/>
+        <w:sz w:val="20"/>
+      </w:rPr>
+    </w:lvl>
+    <w:lvl w:ilvl="4" w:tentative="1">
+      <w:start w:val="1"/>
+      <w:numFmt w:val="bullet"/>
+      <w:lvlText w:val=""/>
+      <w:lvlJc w:val="left"/>
+      <w:pPr>
+        <w:tabs>
+          <w:tab w:val="num" w:pos="3600"/>
+        </w:tabs>
+        <w:ind w:left="3600" w:hanging="360"/>
+      </w:pPr>
+      <w:rPr>
+        <w:rFonts w:ascii="Wingdings" w:hAnsi="Wingdings" w:hint="default"/>
+        <w:sz w:val="20"/>
+      </w:rPr>
+    </w:lvl>
+    <w:lvl w:ilvl="5" w:tentative="1">
+      <w:start w:val="1"/>
+      <w:numFmt w:val="bullet"/>
+      <w:lvlText w:val=""/>
+      <w:lvlJc w:val="left"/>
+      <w:pPr>
+        <w:tabs>
+          <w:tab w:val="num" w:pos="4320"/>
+        </w:tabs>
+        <w:ind w:left="4320" w:hanging="360"/>
+      </w:pPr>
+      <w:rPr>
+        <w:rFonts w:ascii="Wingdings" w:hAnsi="Wingdings" w:hint="default"/>
+        <w:sz w:val="20"/>
+      </w:rPr>
+    </w:lvl>
+    <w:lvl w:ilvl="6" w:tentative="1">
+      <w:start w:val="1"/>
+      <w:numFmt w:val="bullet"/>
+      <w:lvlText w:val=""/>
+      <w:lvlJc w:val="left"/>
+      <w:pPr>
+        <w:tabs>
+          <w:tab w:val="num" w:pos="5040"/>
+        </w:tabs>
+        <w:ind w:left="5040" w:hanging="360"/>
+      </w:pPr>
+      <w:rPr>
+        <w:rFonts w:ascii="Wingdings" w:hAnsi="Wingdings" w:hint="default"/>
+        <w:sz w:val="20"/>
+      </w:rPr>
+    </w:lvl>
+    <w:lvl w:ilvl="7" w:tentative="1">
+      <w:start w:val="1"/>
+      <w:numFmt w:val="bullet"/>
+      <w:lvlText w:val=""/>
+      <w:lvlJc w:val="left"/>
+      <w:pPr>
+        <w:tabs>
+          <w:tab w:val="num" w:pos="5760"/>
+        </w:tabs>
+        <w:ind w:left="5760" w:hanging="360"/>
+      </w:pPr>
+      <w:rPr>
+        <w:rFonts w:ascii="Wingdings" w:hAnsi="Wingdings" w:hint="default"/>
+        <w:sz w:val="20"/>
+      </w:rPr>
+    </w:lvl>
+    <w:lvl w:ilvl="8" w:tentative="1">
+      <w:start w:val="1"/>
+      <w:numFmt w:val="bullet"/>
+      <w:lvlText w:val=""/>
+      <w:lvlJc w:val="left"/>
+      <w:pPr>
+        <w:tabs>
+          <w:tab w:val="num" w:pos="6480"/>
+        </w:tabs>
+        <w:ind w:left="6480" w:hanging="360"/>
+      </w:pPr>
+      <w:rPr>
+        <w:rFonts w:ascii="Wingdings" w:hAnsi="Wingdings" w:hint="default"/>
+        <w:sz w:val="20"/>
+      </w:rPr>
+    </w:lvl>
+  </w:abstractNum>
+  <w:abstractNum w:abstractNumId="3" w15:restartNumberingAfterBreak="0">
+    <w:nsid w:val="5530471F"/>
+    <w:multiLevelType w:val="multilevel"/>
+    <w:tmpl w:val="2612DCD4"/>
+    <w:lvl w:ilvl="0">
+      <w:start w:val="1"/>
+      <w:numFmt w:val="bullet"/>
+      <w:lvlText w:val=""/>
+      <w:lvlJc w:val="left"/>
+      <w:pPr>
+        <w:tabs>
+          <w:tab w:val="num" w:pos="720"/>
+        </w:tabs>
+        <w:ind w:left="720" w:hanging="360"/>
+      </w:pPr>
+      <w:rPr>
+        <w:rFonts w:ascii="Symbol" w:hAnsi="Symbol" w:hint="default"/>
+        <w:sz w:val="20"/>
+      </w:rPr>
+    </w:lvl>
+    <w:lvl w:ilvl="1" w:tentative="1">
+      <w:start w:val="1"/>
+      <w:numFmt w:val="bullet"/>
+      <w:lvlText w:val="o"/>
+      <w:lvlJc w:val="left"/>
+      <w:pPr>
+        <w:tabs>
+          <w:tab w:val="num" w:pos="1440"/>
+        </w:tabs>
+        <w:ind w:left="1440" w:hanging="360"/>
+      </w:pPr>
+      <w:rPr>
+        <w:rFonts w:ascii="Courier New" w:hAnsi="Courier New" w:hint="default"/>
+        <w:sz w:val="20"/>
+      </w:rPr>
+    </w:lvl>
+    <w:lvl w:ilvl="2" w:tentative="1">
+      <w:start w:val="1"/>
+      <w:numFmt w:val="bullet"/>
+      <w:lvlText w:val=""/>
+      <w:lvlJc w:val="left"/>
+      <w:pPr>
+        <w:tabs>
+          <w:tab w:val="num" w:pos="2160"/>
+        </w:tabs>
+        <w:ind w:left="2160" w:hanging="360"/>
+      </w:pPr>
+      <w:rPr>
+        <w:rFonts w:ascii="Wingdings" w:hAnsi="Wingdings" w:hint="default"/>
+        <w:sz w:val="20"/>
+      </w:rPr>
+    </w:lvl>
+    <w:lvl w:ilvl="3" w:tentative="1">
+      <w:start w:val="1"/>
+      <w:numFmt w:val="bullet"/>
+      <w:lvlText w:val=""/>
+      <w:lvlJc w:val="left"/>
+      <w:pPr>
+        <w:tabs>
+          <w:tab w:val="num" w:pos="2880"/>
+        </w:tabs>
+        <w:ind w:left="2880" w:hanging="360"/>
+      </w:pPr>
+      <w:rPr>
+        <w:rFonts w:ascii="Wingdings" w:hAnsi="Wingdings" w:hint="default"/>
+        <w:sz w:val="20"/>
+      </w:rPr>
+    </w:lvl>
+    <w:lvl w:ilvl="4" w:tentative="1">
+      <w:start w:val="1"/>
+      <w:numFmt w:val="bullet"/>
+      <w:lvlText w:val=""/>
+      <w:lvlJc w:val="left"/>
+      <w:pPr>
+        <w:tabs>
+          <w:tab w:val="num" w:pos="3600"/>
+        </w:tabs>
+        <w:ind w:left="3600" w:hanging="360"/>
+      </w:pPr>
+      <w:rPr>
+        <w:rFonts w:ascii="Wingdings" w:hAnsi="Wingdings" w:hint="default"/>
+        <w:sz w:val="20"/>
+      </w:rPr>
+    </w:lvl>
+    <w:lvl w:ilvl="5" w:tentative="1">
+      <w:start w:val="1"/>
+      <w:numFmt w:val="bullet"/>
+      <w:lvlText w:val=""/>
+      <w:lvlJc w:val="left"/>
+      <w:pPr>
+        <w:tabs>
+          <w:tab w:val="num" w:pos="4320"/>
+        </w:tabs>
+        <w:ind w:left="4320" w:hanging="360"/>
+      </w:pPr>
+      <w:rPr>
+        <w:rFonts w:ascii="Wingdings" w:hAnsi="Wingdings" w:hint="default"/>
+        <w:sz w:val="20"/>
+      </w:rPr>
+    </w:lvl>
+    <w:lvl w:ilvl="6" w:tentative="1">
+      <w:start w:val="1"/>
+      <w:numFmt w:val="bullet"/>
+      <w:lvlText w:val=""/>
+      <w:lvlJc w:val="left"/>
+      <w:pPr>
+        <w:tabs>
+          <w:tab w:val="num" w:pos="5040"/>
+        </w:tabs>
+        <w:ind w:left="5040" w:hanging="360"/>
+      </w:pPr>
+      <w:rPr>
+        <w:rFonts w:ascii="Wingdings" w:hAnsi="Wingdings" w:hint="default"/>
+        <w:sz w:val="20"/>
+      </w:rPr>
+    </w:lvl>
+    <w:lvl w:ilvl="7" w:tentative="1">
+      <w:start w:val="1"/>
+      <w:numFmt w:val="bullet"/>
+      <w:lvlText w:val=""/>
+      <w:lvlJc w:val="left"/>
+      <w:pPr>
+        <w:tabs>
+          <w:tab w:val="num" w:pos="5760"/>
+        </w:tabs>
+        <w:ind w:left="5760" w:hanging="360"/>
+      </w:pPr>
+      <w:rPr>
+        <w:rFonts w:ascii="Wingdings" w:hAnsi="Wingdings" w:hint="default"/>
+        <w:sz w:val="20"/>
+      </w:rPr>
+    </w:lvl>
+    <w:lvl w:ilvl="8" w:tentative="1">
+      <w:start w:val="1"/>
+      <w:numFmt w:val="bullet"/>
+      <w:lvlText w:val=""/>
+      <w:lvlJc w:val="left"/>
+      <w:pPr>
+        <w:tabs>
+          <w:tab w:val="num" w:pos="6480"/>
+        </w:tabs>
+        <w:ind w:left="6480" w:hanging="360"/>
+      </w:pPr>
+      <w:rPr>
+        <w:rFonts w:ascii="Wingdings" w:hAnsi="Wingdings" w:hint="default"/>
+        <w:sz w:val="20"/>
+      </w:rPr>
+    </w:lvl>
+  </w:abstractNum>
+  <w:abstractNum w:abstractNumId="4" w15:restartNumberingAfterBreak="0">
+    <w:nsid w:val="7DAD3188"/>
+    <w:multiLevelType w:val="multilevel"/>
+    <w:tmpl w:val="E640B518"/>
     <w:lvl w:ilvl="0">
       <w:start w:val="1"/>
       <w:numFmt w:val="decimal"/>
@@ -13679,467 +14126,20 @@
       </w:pPr>
     </w:lvl>
   </w:abstractNum>
-  <w:abstractNum w:abstractNumId="2" w15:restartNumberingAfterBreak="0">
-    <w:nsid w:val="5DD040B2"/>
-    <w:multiLevelType w:val="multilevel"/>
-    <w:tmpl w:val="38080960"/>
-    <w:lvl w:ilvl="0">
-      <w:start w:val="1"/>
-      <w:numFmt w:val="bullet"/>
-      <w:lvlText w:val=""/>
-      <w:lvlJc w:val="left"/>
-      <w:pPr>
-        <w:tabs>
-          <w:tab w:val="num" w:pos="720"/>
-        </w:tabs>
-        <w:ind w:left="720" w:hanging="360"/>
-      </w:pPr>
-      <w:rPr>
-        <w:rFonts w:ascii="Symbol" w:hAnsi="Symbol" w:hint="default"/>
-        <w:sz w:val="20"/>
-      </w:rPr>
-    </w:lvl>
-    <w:lvl w:ilvl="1" w:tentative="1">
-      <w:start w:val="1"/>
-      <w:numFmt w:val="bullet"/>
-      <w:lvlText w:val="o"/>
-      <w:lvlJc w:val="left"/>
-      <w:pPr>
-        <w:tabs>
-          <w:tab w:val="num" w:pos="1440"/>
-        </w:tabs>
-        <w:ind w:left="1440" w:hanging="360"/>
-      </w:pPr>
-      <w:rPr>
-        <w:rFonts w:ascii="Courier New" w:hAnsi="Courier New" w:hint="default"/>
-        <w:sz w:val="20"/>
-      </w:rPr>
-    </w:lvl>
-    <w:lvl w:ilvl="2" w:tentative="1">
-      <w:start w:val="1"/>
-      <w:numFmt w:val="bullet"/>
-      <w:lvlText w:val=""/>
-      <w:lvlJc w:val="left"/>
-      <w:pPr>
-        <w:tabs>
-          <w:tab w:val="num" w:pos="2160"/>
-        </w:tabs>
-        <w:ind w:left="2160" w:hanging="360"/>
-      </w:pPr>
-      <w:rPr>
-        <w:rFonts w:ascii="Wingdings" w:hAnsi="Wingdings" w:hint="default"/>
-        <w:sz w:val="20"/>
-      </w:rPr>
-    </w:lvl>
-    <w:lvl w:ilvl="3" w:tentative="1">
-      <w:start w:val="1"/>
-      <w:numFmt w:val="bullet"/>
-      <w:lvlText w:val=""/>
-      <w:lvlJc w:val="left"/>
-      <w:pPr>
-        <w:tabs>
-          <w:tab w:val="num" w:pos="2880"/>
-        </w:tabs>
-        <w:ind w:left="2880" w:hanging="360"/>
-      </w:pPr>
-      <w:rPr>
-        <w:rFonts w:ascii="Wingdings" w:hAnsi="Wingdings" w:hint="default"/>
-        <w:sz w:val="20"/>
-      </w:rPr>
-    </w:lvl>
-    <w:lvl w:ilvl="4" w:tentative="1">
-      <w:start w:val="1"/>
-      <w:numFmt w:val="bullet"/>
-      <w:lvlText w:val=""/>
-      <w:lvlJc w:val="left"/>
-      <w:pPr>
-        <w:tabs>
-          <w:tab w:val="num" w:pos="3600"/>
-        </w:tabs>
-        <w:ind w:left="3600" w:hanging="360"/>
-      </w:pPr>
-      <w:rPr>
-        <w:rFonts w:ascii="Wingdings" w:hAnsi="Wingdings" w:hint="default"/>
-        <w:sz w:val="20"/>
-      </w:rPr>
-    </w:lvl>
-    <w:lvl w:ilvl="5" w:tentative="1">
-      <w:start w:val="1"/>
-      <w:numFmt w:val="bullet"/>
-      <w:lvlText w:val=""/>
-      <w:lvlJc w:val="left"/>
-      <w:pPr>
-        <w:tabs>
-          <w:tab w:val="num" w:pos="4320"/>
-        </w:tabs>
-        <w:ind w:left="4320" w:hanging="360"/>
-      </w:pPr>
-      <w:rPr>
-        <w:rFonts w:ascii="Wingdings" w:hAnsi="Wingdings" w:hint="default"/>
-        <w:sz w:val="20"/>
-      </w:rPr>
-    </w:lvl>
-    <w:lvl w:ilvl="6" w:tentative="1">
-      <w:start w:val="1"/>
-      <w:numFmt w:val="bullet"/>
-      <w:lvlText w:val=""/>
-      <w:lvlJc w:val="left"/>
-      <w:pPr>
-        <w:tabs>
-          <w:tab w:val="num" w:pos="5040"/>
-        </w:tabs>
-        <w:ind w:left="5040" w:hanging="360"/>
-      </w:pPr>
-      <w:rPr>
-        <w:rFonts w:ascii="Wingdings" w:hAnsi="Wingdings" w:hint="default"/>
-        <w:sz w:val="20"/>
-      </w:rPr>
-    </w:lvl>
-    <w:lvl w:ilvl="7" w:tentative="1">
-      <w:start w:val="1"/>
-      <w:numFmt w:val="bullet"/>
-      <w:lvlText w:val=""/>
-      <w:lvlJc w:val="left"/>
-      <w:pPr>
-        <w:tabs>
-          <w:tab w:val="num" w:pos="5760"/>
-        </w:tabs>
-        <w:ind w:left="5760" w:hanging="360"/>
-      </w:pPr>
-      <w:rPr>
-        <w:rFonts w:ascii="Wingdings" w:hAnsi="Wingdings" w:hint="default"/>
-        <w:sz w:val="20"/>
-      </w:rPr>
-    </w:lvl>
-    <w:lvl w:ilvl="8" w:tentative="1">
-      <w:start w:val="1"/>
-      <w:numFmt w:val="bullet"/>
-      <w:lvlText w:val=""/>
-      <w:lvlJc w:val="left"/>
-      <w:pPr>
-        <w:tabs>
-          <w:tab w:val="num" w:pos="6480"/>
-        </w:tabs>
-        <w:ind w:left="6480" w:hanging="360"/>
-      </w:pPr>
-      <w:rPr>
-        <w:rFonts w:ascii="Wingdings" w:hAnsi="Wingdings" w:hint="default"/>
-        <w:sz w:val="20"/>
-      </w:rPr>
-    </w:lvl>
-  </w:abstractNum>
-  <w:abstractNum w:abstractNumId="3" w15:restartNumberingAfterBreak="0">
-    <w:nsid w:val="716E4FD7"/>
-    <w:multiLevelType w:val="multilevel"/>
-    <w:tmpl w:val="6CC099C2"/>
-    <w:lvl w:ilvl="0">
-      <w:start w:val="1"/>
-      <w:numFmt w:val="bullet"/>
-      <w:lvlText w:val=""/>
-      <w:lvlJc w:val="left"/>
-      <w:pPr>
-        <w:tabs>
-          <w:tab w:val="num" w:pos="720"/>
-        </w:tabs>
-        <w:ind w:left="720" w:hanging="360"/>
-      </w:pPr>
-      <w:rPr>
-        <w:rFonts w:ascii="Symbol" w:hAnsi="Symbol" w:hint="default"/>
-        <w:sz w:val="20"/>
-      </w:rPr>
-    </w:lvl>
-    <w:lvl w:ilvl="1" w:tentative="1">
-      <w:start w:val="1"/>
-      <w:numFmt w:val="bullet"/>
-      <w:lvlText w:val="o"/>
-      <w:lvlJc w:val="left"/>
-      <w:pPr>
-        <w:tabs>
-          <w:tab w:val="num" w:pos="1440"/>
-        </w:tabs>
-        <w:ind w:left="1440" w:hanging="360"/>
-      </w:pPr>
-      <w:rPr>
-        <w:rFonts w:ascii="Courier New" w:hAnsi="Courier New" w:hint="default"/>
-        <w:sz w:val="20"/>
-      </w:rPr>
-    </w:lvl>
-    <w:lvl w:ilvl="2" w:tentative="1">
-      <w:start w:val="1"/>
-      <w:numFmt w:val="bullet"/>
-      <w:lvlText w:val=""/>
-      <w:lvlJc w:val="left"/>
-      <w:pPr>
-        <w:tabs>
-          <w:tab w:val="num" w:pos="2160"/>
-        </w:tabs>
-        <w:ind w:left="2160" w:hanging="360"/>
-      </w:pPr>
-      <w:rPr>
-        <w:rFonts w:ascii="Wingdings" w:hAnsi="Wingdings" w:hint="default"/>
-        <w:sz w:val="20"/>
-      </w:rPr>
-    </w:lvl>
-    <w:lvl w:ilvl="3" w:tentative="1">
-      <w:start w:val="1"/>
-      <w:numFmt w:val="bullet"/>
-      <w:lvlText w:val=""/>
-      <w:lvlJc w:val="left"/>
-      <w:pPr>
-        <w:tabs>
-          <w:tab w:val="num" w:pos="2880"/>
-        </w:tabs>
-        <w:ind w:left="2880" w:hanging="360"/>
-      </w:pPr>
-      <w:rPr>
-        <w:rFonts w:ascii="Wingdings" w:hAnsi="Wingdings" w:hint="default"/>
-        <w:sz w:val="20"/>
-      </w:rPr>
-    </w:lvl>
-    <w:lvl w:ilvl="4" w:tentative="1">
-      <w:start w:val="1"/>
-      <w:numFmt w:val="bullet"/>
-      <w:lvlText w:val=""/>
-      <w:lvlJc w:val="left"/>
-      <w:pPr>
-        <w:tabs>
-          <w:tab w:val="num" w:pos="3600"/>
-        </w:tabs>
-        <w:ind w:left="3600" w:hanging="360"/>
-      </w:pPr>
-      <w:rPr>
-        <w:rFonts w:ascii="Wingdings" w:hAnsi="Wingdings" w:hint="default"/>
-        <w:sz w:val="20"/>
-      </w:rPr>
-    </w:lvl>
-    <w:lvl w:ilvl="5" w:tentative="1">
-      <w:start w:val="1"/>
-      <w:numFmt w:val="bullet"/>
-      <w:lvlText w:val=""/>
-      <w:lvlJc w:val="left"/>
-      <w:pPr>
-        <w:tabs>
-          <w:tab w:val="num" w:pos="4320"/>
-        </w:tabs>
-        <w:ind w:left="4320" w:hanging="360"/>
-      </w:pPr>
-      <w:rPr>
-        <w:rFonts w:ascii="Wingdings" w:hAnsi="Wingdings" w:hint="default"/>
-        <w:sz w:val="20"/>
-      </w:rPr>
-    </w:lvl>
-    <w:lvl w:ilvl="6" w:tentative="1">
-      <w:start w:val="1"/>
-      <w:numFmt w:val="bullet"/>
-      <w:lvlText w:val=""/>
-      <w:lvlJc w:val="left"/>
-      <w:pPr>
-        <w:tabs>
-          <w:tab w:val="num" w:pos="5040"/>
-        </w:tabs>
-        <w:ind w:left="5040" w:hanging="360"/>
-      </w:pPr>
-      <w:rPr>
-        <w:rFonts w:ascii="Wingdings" w:hAnsi="Wingdings" w:hint="default"/>
-        <w:sz w:val="20"/>
-      </w:rPr>
-    </w:lvl>
-    <w:lvl w:ilvl="7" w:tentative="1">
-      <w:start w:val="1"/>
-      <w:numFmt w:val="bullet"/>
-      <w:lvlText w:val=""/>
-      <w:lvlJc w:val="left"/>
-      <w:pPr>
-        <w:tabs>
-          <w:tab w:val="num" w:pos="5760"/>
-        </w:tabs>
-        <w:ind w:left="5760" w:hanging="360"/>
-      </w:pPr>
-      <w:rPr>
-        <w:rFonts w:ascii="Wingdings" w:hAnsi="Wingdings" w:hint="default"/>
-        <w:sz w:val="20"/>
-      </w:rPr>
-    </w:lvl>
-    <w:lvl w:ilvl="8" w:tentative="1">
-      <w:start w:val="1"/>
-      <w:numFmt w:val="bullet"/>
-      <w:lvlText w:val=""/>
-      <w:lvlJc w:val="left"/>
-      <w:pPr>
-        <w:tabs>
-          <w:tab w:val="num" w:pos="6480"/>
-        </w:tabs>
-        <w:ind w:left="6480" w:hanging="360"/>
-      </w:pPr>
-      <w:rPr>
-        <w:rFonts w:ascii="Wingdings" w:hAnsi="Wingdings" w:hint="default"/>
-        <w:sz w:val="20"/>
-      </w:rPr>
-    </w:lvl>
-  </w:abstractNum>
-  <w:abstractNum w:abstractNumId="4" w15:restartNumberingAfterBreak="0">
-    <w:nsid w:val="77FA787C"/>
-    <w:multiLevelType w:val="multilevel"/>
-    <w:tmpl w:val="E5849EC0"/>
-    <w:lvl w:ilvl="0">
-      <w:start w:val="1"/>
-      <w:numFmt w:val="bullet"/>
-      <w:lvlText w:val=""/>
-      <w:lvlJc w:val="left"/>
-      <w:pPr>
-        <w:tabs>
-          <w:tab w:val="num" w:pos="720"/>
-        </w:tabs>
-        <w:ind w:left="720" w:hanging="360"/>
-      </w:pPr>
-      <w:rPr>
-        <w:rFonts w:ascii="Symbol" w:hAnsi="Symbol" w:hint="default"/>
-        <w:sz w:val="20"/>
-      </w:rPr>
-    </w:lvl>
-    <w:lvl w:ilvl="1" w:tentative="1">
-      <w:start w:val="1"/>
-      <w:numFmt w:val="bullet"/>
-      <w:lvlText w:val="o"/>
-      <w:lvlJc w:val="left"/>
-      <w:pPr>
-        <w:tabs>
-          <w:tab w:val="num" w:pos="1440"/>
-        </w:tabs>
-        <w:ind w:left="1440" w:hanging="360"/>
-      </w:pPr>
-      <w:rPr>
-        <w:rFonts w:ascii="Courier New" w:hAnsi="Courier New" w:hint="default"/>
-        <w:sz w:val="20"/>
-      </w:rPr>
-    </w:lvl>
-    <w:lvl w:ilvl="2" w:tentative="1">
-      <w:start w:val="1"/>
-      <w:numFmt w:val="bullet"/>
-      <w:lvlText w:val=""/>
-      <w:lvlJc w:val="left"/>
-      <w:pPr>
-        <w:tabs>
-          <w:tab w:val="num" w:pos="2160"/>
-        </w:tabs>
-        <w:ind w:left="2160" w:hanging="360"/>
-      </w:pPr>
-      <w:rPr>
-        <w:rFonts w:ascii="Wingdings" w:hAnsi="Wingdings" w:hint="default"/>
-        <w:sz w:val="20"/>
-      </w:rPr>
-    </w:lvl>
-    <w:lvl w:ilvl="3" w:tentative="1">
-      <w:start w:val="1"/>
-      <w:numFmt w:val="bullet"/>
-      <w:lvlText w:val=""/>
-      <w:lvlJc w:val="left"/>
-      <w:pPr>
-        <w:tabs>
-          <w:tab w:val="num" w:pos="2880"/>
-        </w:tabs>
-        <w:ind w:left="2880" w:hanging="360"/>
-      </w:pPr>
-      <w:rPr>
-        <w:rFonts w:ascii="Wingdings" w:hAnsi="Wingdings" w:hint="default"/>
-        <w:sz w:val="20"/>
-      </w:rPr>
-    </w:lvl>
-    <w:lvl w:ilvl="4" w:tentative="1">
-      <w:start w:val="1"/>
-      <w:numFmt w:val="bullet"/>
-      <w:lvlText w:val=""/>
-      <w:lvlJc w:val="left"/>
-      <w:pPr>
-        <w:tabs>
-          <w:tab w:val="num" w:pos="3600"/>
-        </w:tabs>
-        <w:ind w:left="3600" w:hanging="360"/>
-      </w:pPr>
-      <w:rPr>
-        <w:rFonts w:ascii="Wingdings" w:hAnsi="Wingdings" w:hint="default"/>
-        <w:sz w:val="20"/>
-      </w:rPr>
-    </w:lvl>
-    <w:lvl w:ilvl="5" w:tentative="1">
-      <w:start w:val="1"/>
-      <w:numFmt w:val="bullet"/>
-      <w:lvlText w:val=""/>
-      <w:lvlJc w:val="left"/>
-      <w:pPr>
-        <w:tabs>
-          <w:tab w:val="num" w:pos="4320"/>
-        </w:tabs>
-        <w:ind w:left="4320" w:hanging="360"/>
-      </w:pPr>
-      <w:rPr>
-        <w:rFonts w:ascii="Wingdings" w:hAnsi="Wingdings" w:hint="default"/>
-        <w:sz w:val="20"/>
-      </w:rPr>
-    </w:lvl>
-    <w:lvl w:ilvl="6" w:tentative="1">
-      <w:start w:val="1"/>
-      <w:numFmt w:val="bullet"/>
-      <w:lvlText w:val=""/>
-      <w:lvlJc w:val="left"/>
-      <w:pPr>
-        <w:tabs>
-          <w:tab w:val="num" w:pos="5040"/>
-        </w:tabs>
-        <w:ind w:left="5040" w:hanging="360"/>
-      </w:pPr>
-      <w:rPr>
-        <w:rFonts w:ascii="Wingdings" w:hAnsi="Wingdings" w:hint="default"/>
-        <w:sz w:val="20"/>
-      </w:rPr>
-    </w:lvl>
-    <w:lvl w:ilvl="7" w:tentative="1">
-      <w:start w:val="1"/>
-      <w:numFmt w:val="bullet"/>
-      <w:lvlText w:val=""/>
-      <w:lvlJc w:val="left"/>
-      <w:pPr>
-        <w:tabs>
-          <w:tab w:val="num" w:pos="5760"/>
-        </w:tabs>
-        <w:ind w:left="5760" w:hanging="360"/>
-      </w:pPr>
-      <w:rPr>
-        <w:rFonts w:ascii="Wingdings" w:hAnsi="Wingdings" w:hint="default"/>
-        <w:sz w:val="20"/>
-      </w:rPr>
-    </w:lvl>
-    <w:lvl w:ilvl="8" w:tentative="1">
-      <w:start w:val="1"/>
-      <w:numFmt w:val="bullet"/>
-      <w:lvlText w:val=""/>
-      <w:lvlJc w:val="left"/>
-      <w:pPr>
-        <w:tabs>
-          <w:tab w:val="num" w:pos="6480"/>
-        </w:tabs>
-        <w:ind w:left="6480" w:hanging="360"/>
-      </w:pPr>
-      <w:rPr>
-        <w:rFonts w:ascii="Wingdings" w:hAnsi="Wingdings" w:hint="default"/>
-        <w:sz w:val="20"/>
-      </w:rPr>
-    </w:lvl>
-  </w:abstractNum>
-  <w:num w:numId="1" w16cid:durableId="1832481435">
+  <w:num w:numId="1" w16cid:durableId="936601983">
+    <w:abstractNumId w:val="3"/>
+  </w:num>
+  <w:num w:numId="2" w16cid:durableId="122113735">
+    <w:abstractNumId w:val="4"/>
+  </w:num>
+  <w:num w:numId="3" w16cid:durableId="1649430628">
+    <w:abstractNumId w:val="2"/>
+  </w:num>
+  <w:num w:numId="4" w16cid:durableId="2141678696">
     <w:abstractNumId w:val="0"/>
   </w:num>
-  <w:num w:numId="2" w16cid:durableId="1455102621">
+  <w:num w:numId="5" w16cid:durableId="1983121335">
     <w:abstractNumId w:val="1"/>
-  </w:num>
-  <w:num w:numId="3" w16cid:durableId="177280763">
-    <w:abstractNumId w:val="3"/>
-  </w:num>
-  <w:num w:numId="4" w16cid:durableId="1789734583">
-    <w:abstractNumId w:val="4"/>
-  </w:num>
-  <w:num w:numId="5" w16cid:durableId="28117849">
-    <w:abstractNumId w:val="2"/>
   </w:num>
 </w:numbering>
 </file>
@@ -14760,7 +14760,7 @@
     <w:autoRedefine/>
     <w:uiPriority w:val="39"/>
     <w:unhideWhenUsed/>
-    <w:rsid w:val="0030774D"/>
+    <w:rsid w:val="004C30B2"/>
     <w:pPr>
       <w:spacing w:after="100"/>
     </w:pPr>
@@ -14772,7 +14772,7 @@
     <w:autoRedefine/>
     <w:uiPriority w:val="39"/>
     <w:unhideWhenUsed/>
-    <w:rsid w:val="0030774D"/>
+    <w:rsid w:val="004C30B2"/>
     <w:pPr>
       <w:spacing w:after="100"/>
       <w:ind w:left="240"/>
@@ -14783,7 +14783,7 @@
     <w:hidden/>
     <w:uiPriority w:val="99"/>
     <w:semiHidden/>
-    <w:rsid w:val="0030774D"/>
+    <w:rsid w:val="004C30B2"/>
     <w:rPr>
       <w:rFonts w:eastAsiaTheme="minorEastAsia"/>
       <w:sz w:val="24"/>

</xml_diff>